<commit_message>
docs(ch1): expand introduction, add Table 1.1, Significance, and SDG sections
Tasks 1.1-1.4 and 8.1 of THESIS_REVISION_PLAN.md:
- Expand opening with survey of existing IPPP models (XGBoost, LightGBM,
  LR, RF, NN) and their reported performance, plus three-limitation
  comparative framing ending in the multi-stage transition
- Add Table 1.1 comparing five prior studies (caption above, intro
  sentence before, discussion paragraph after)
- Number headings 1.1-1.3; add 1.5 Significance of the Study and
  1.6 UN SDG alignment; renumber Scope and Limitations to 1.7
- Convert limitations enumeration to flowing prose

Co-Authored-By: Claude Fable 5 <noreply@anthropic.com>
</commit_message>
<xml_diff>
--- a/Beley-Reyes_Thesis2-ACM.docx
+++ b/Beley-Reyes_Thesis2-ACM.docx
@@ -5161,17 +5161,397 @@
     </w:p>
     <w:p>
       <w:pPr>
+        <w:pStyle w:val="ThesisParagraphText"/>
+      </w:pPr>
+      <w:r>
+        <w:t>A substantial body of machine learning research has addressed the IPPP and adjacent receivables-prediction problems, employing models such as Logistic Regression, Random Forest, XGBoost, LightGBM, and neural networks. Schoonbee, Moore, and van Vuuren [8] applied a machine-learning decision-support approach to invoice payment prediction in an educational setting and reported classification accuracies of approximately 80–85% using tree-based ensembles, while Moore and van Vuuren [4] combined survival analysis with machine learning in their Modelling Invoice Payment Predictions (MIPP) framework to forecast the settlement timing of customer invoices. In the educational domain, Mugorobin et al. [3] developed an estimation system for late payment of school tuition fees, and Martikainen [5] demonstrated that statistical learning methods such as logistic regression can predict late payment of sales invoices with actionable discrimination. At the customer level, Cheong [29] and Appel et al. [28] showed that ensemble models trained on transaction histories can reduce unnecessary collection interventions, and Abbas and Hussein [12] confirmed that modern boosting algorithms such as XGBoost and LightGBM significantly outperform conventional statistical baselines in loan default prediction.</w:t>
+      </w:r>
+    </w:p>
+    <w:p>
+      <w:pPr>
+        <w:pStyle w:val="ThesisParagraphText"/>
+      </w:pPr>
+      <w:r>
+        <w:t>Despite these advances, existing approaches share three limitations: first, they model payment behavior using aggregate customer- or student-level features, discarding the line-item granularity at which invoices are actually issued; second, they treat payment delay as a binary or nominal multi-class target, ignoring the inherent ordering of delay brackets; and third, they benchmark only a narrow set of five to eight standard classifiers, leaving ordinal decompositions, hierarchical two-stage architectures, and survival-analysis-derived features systematically untested. This study addresses these gaps by introducing a multi-stage pipeline across 1,092 experimental configurations.</w:t>
+      </w:r>
+    </w:p>
+    <w:p>
+      <w:pPr>
+        <w:pStyle w:val="ThesisParagraphText"/>
+      </w:pPr>
+      <w:r>
+        <w:t>Table 1.1 summarizes the most directly comparable invoice payment prediction studies, the datasets and models they employed, their reported performance, and the principal limitation each leaves unaddressed.</w:t>
+      </w:r>
+    </w:p>
+    <w:p>
+      <w:pPr>
+        <w:pStyle w:val="Caption"/>
+      </w:pPr>
+      <w:r>
+        <w:t>Table 1.1. Summary of existing machine learning approaches to invoice payment prediction.</w:t>
+      </w:r>
+    </w:p>
+    <w:tbl>
+      <w:tblPr>
+        <w:tblStyle w:val="TableGridLight"/>
+        <w:tblW w:type="auto" w:w="0"/>
+        <w:tblLayout w:type="autofit"/>
+        <w:tblLook w:firstColumn="1" w:firstRow="1" w:lastColumn="0" w:lastRow="0" w:noHBand="0" w:noVBand="1" w:val="04A0"/>
+      </w:tblPr>
+      <w:tblGrid>
+        <w:gridCol w:w="1728"/>
+        <w:gridCol w:w="1728"/>
+        <w:gridCol w:w="1728"/>
+        <w:gridCol w:w="1728"/>
+        <w:gridCol w:w="1728"/>
+      </w:tblGrid>
+      <w:tr>
+        <w:tc>
+          <w:tcPr>
+            <w:tcW w:type="dxa" w:w="1728"/>
+          </w:tcPr>
+          <w:p>
+            <w:r>
+              <w:rPr>
+                <w:b/>
+              </w:rPr>
+              <w:t>Study</w:t>
+            </w:r>
+          </w:p>
+        </w:tc>
+        <w:tc>
+          <w:tcPr>
+            <w:tcW w:type="dxa" w:w="1728"/>
+          </w:tcPr>
+          <w:p>
+            <w:r>
+              <w:rPr>
+                <w:b/>
+              </w:rPr>
+              <w:t>Dataset Type</w:t>
+            </w:r>
+          </w:p>
+        </w:tc>
+        <w:tc>
+          <w:tcPr>
+            <w:tcW w:type="dxa" w:w="1728"/>
+          </w:tcPr>
+          <w:p>
+            <w:r>
+              <w:rPr>
+                <w:b/>
+              </w:rPr>
+              <w:t>Models Used</w:t>
+            </w:r>
+          </w:p>
+        </w:tc>
+        <w:tc>
+          <w:tcPr>
+            <w:tcW w:type="dxa" w:w="1728"/>
+          </w:tcPr>
+          <w:p>
+            <w:r>
+              <w:rPr>
+                <w:b/>
+              </w:rPr>
+              <w:t>Best Accuracy / F1</w:t>
+            </w:r>
+          </w:p>
+        </w:tc>
+        <w:tc>
+          <w:tcPr>
+            <w:tcW w:type="dxa" w:w="1728"/>
+          </w:tcPr>
+          <w:p>
+            <w:r>
+              <w:rPr>
+                <w:b/>
+              </w:rPr>
+              <w:t>Key Limitation</w:t>
+            </w:r>
+          </w:p>
+        </w:tc>
+      </w:tr>
+      <w:tr>
+        <w:tc>
+          <w:tcPr>
+            <w:tcW w:type="dxa" w:w="1728"/>
+          </w:tcPr>
+          <w:p>
+            <w:r>
+              <w:t>Moore &amp; van Vuuren (2020) [4]</w:t>
+            </w:r>
+          </w:p>
+        </w:tc>
+        <w:tc>
+          <w:tcPr>
+            <w:tcW w:type="dxa" w:w="1728"/>
+          </w:tcPr>
+          <w:p>
+            <w:r>
+              <w:t>Corporate customer invoices</w:t>
+            </w:r>
+          </w:p>
+        </w:tc>
+        <w:tc>
+          <w:tcPr>
+            <w:tcW w:type="dxa" w:w="1728"/>
+          </w:tcPr>
+          <w:p>
+            <w:r>
+              <w:t>Survival analysis + ML (MIPP framework)</w:t>
+            </w:r>
+          </w:p>
+        </w:tc>
+        <w:tc>
+          <w:tcPr>
+            <w:tcW w:type="dxa" w:w="1728"/>
+          </w:tcPr>
+          <w:p>
+            <w:r>
+              <w:t>Time-to-payment estimates; bracket-level F1 not reported</w:t>
+            </w:r>
+          </w:p>
+        </w:tc>
+        <w:tc>
+          <w:tcPr>
+            <w:tcW w:type="dxa" w:w="1728"/>
+          </w:tcPr>
+          <w:p>
+            <w:r>
+              <w:t>Aggregate customer features; no ordinal target</w:t>
+            </w:r>
+          </w:p>
+        </w:tc>
+      </w:tr>
+      <w:tr>
+        <w:tc>
+          <w:tcPr>
+            <w:tcW w:type="dxa" w:w="1728"/>
+          </w:tcPr>
+          <w:p>
+            <w:r>
+              <w:t>Schoonbee et al. (2021) [8]</w:t>
+            </w:r>
+          </w:p>
+        </w:tc>
+        <w:tc>
+          <w:tcPr>
+            <w:tcW w:type="dxa" w:w="1728"/>
+          </w:tcPr>
+          <w:p>
+            <w:r>
+              <w:t>Educational institution invoices (South Africa)</w:t>
+            </w:r>
+          </w:p>
+        </w:tc>
+        <w:tc>
+          <w:tcPr>
+            <w:tcW w:type="dxa" w:w="1728"/>
+          </w:tcPr>
+          <w:p>
+            <w:r>
+              <w:t>Logistic Regression, Random Forest, XGBoost, Neural Networks</w:t>
+            </w:r>
+          </w:p>
+        </w:tc>
+        <w:tc>
+          <w:tcPr>
+            <w:tcW w:type="dxa" w:w="1728"/>
+          </w:tcPr>
+          <w:p>
+            <w:r>
+              <w:t>Accuracy ≈ 80–85%</w:t>
+            </w:r>
+          </w:p>
+        </w:tc>
+        <w:tc>
+          <w:tcPr>
+            <w:tcW w:type="dxa" w:w="1728"/>
+          </w:tcPr>
+          <w:p>
+            <w:r>
+              <w:t>Broad student-level features; single-stage classifiers only</w:t>
+            </w:r>
+          </w:p>
+        </w:tc>
+      </w:tr>
+      <w:tr>
+        <w:tc>
+          <w:tcPr>
+            <w:tcW w:type="dxa" w:w="1728"/>
+          </w:tcPr>
+          <w:p>
+            <w:r>
+              <w:t>Mugorobin et al. (2020) [3]</w:t>
+            </w:r>
+          </w:p>
+        </w:tc>
+        <w:tc>
+          <w:tcPr>
+            <w:tcW w:type="dxa" w:w="1728"/>
+          </w:tcPr>
+          <w:p>
+            <w:r>
+              <w:t>School tuition fee records</w:t>
+            </w:r>
+          </w:p>
+        </w:tc>
+        <w:tc>
+          <w:tcPr>
+            <w:tcW w:type="dxa" w:w="1728"/>
+          </w:tcPr>
+          <w:p>
+            <w:r>
+              <w:t>Rule-based estimation with classification</w:t>
+            </w:r>
+          </w:p>
+        </w:tc>
+        <w:tc>
+          <w:tcPr>
+            <w:tcW w:type="dxa" w:w="1728"/>
+          </w:tcPr>
+          <w:p>
+            <w:r>
+              <w:t>Not reported on standardized metrics</w:t>
+            </w:r>
+          </w:p>
+        </w:tc>
+        <w:tc>
+          <w:tcPr>
+            <w:tcW w:type="dxa" w:w="1728"/>
+          </w:tcPr>
+          <w:p>
+            <w:r>
+              <w:t>Heuristic system; no ensemble benchmarking</w:t>
+            </w:r>
+          </w:p>
+        </w:tc>
+      </w:tr>
+      <w:tr>
+        <w:tc>
+          <w:tcPr>
+            <w:tcW w:type="dxa" w:w="1728"/>
+          </w:tcPr>
+          <w:p>
+            <w:r>
+              <w:t>Martikainen (2023) [5]</w:t>
+            </w:r>
+          </w:p>
+        </w:tc>
+        <w:tc>
+          <w:tcPr>
+            <w:tcW w:type="dxa" w:w="1728"/>
+          </w:tcPr>
+          <w:p>
+            <w:r>
+              <w:t>B2B sales invoices (Finland)</w:t>
+            </w:r>
+          </w:p>
+        </w:tc>
+        <w:tc>
+          <w:tcPr>
+            <w:tcW w:type="dxa" w:w="1728"/>
+          </w:tcPr>
+          <w:p>
+            <w:r>
+              <w:t>Logistic Regression, statistical learning</w:t>
+            </w:r>
+          </w:p>
+        </w:tc>
+        <w:tc>
+          <w:tcPr>
+            <w:tcW w:type="dxa" w:w="1728"/>
+          </w:tcPr>
+          <w:p>
+            <w:r>
+              <w:t>Moderate discrimination (AUC-based)</w:t>
+            </w:r>
+          </w:p>
+        </w:tc>
+        <w:tc>
+          <w:tcPr>
+            <w:tcW w:type="dxa" w:w="1728"/>
+          </w:tcPr>
+          <w:p>
+            <w:r>
+              <w:t>Few classifiers; no class-imbalance treatment</w:t>
+            </w:r>
+          </w:p>
+        </w:tc>
+      </w:tr>
+      <w:tr>
+        <w:tc>
+          <w:tcPr>
+            <w:tcW w:type="dxa" w:w="1728"/>
+          </w:tcPr>
+          <w:p>
+            <w:r>
+              <w:t>Cheong (2022) [29]</w:t>
+            </w:r>
+          </w:p>
+        </w:tc>
+        <w:tc>
+          <w:tcPr>
+            <w:tcW w:type="dxa" w:w="1728"/>
+          </w:tcPr>
+          <w:p>
+            <w:r>
+              <w:t>Corporate accounts receivable</w:t>
+            </w:r>
+          </w:p>
+        </w:tc>
+        <w:tc>
+          <w:tcPr>
+            <w:tcW w:type="dxa" w:w="1728"/>
+          </w:tcPr>
+          <w:p>
+            <w:r>
+              <w:t>Customer-level gradient boosting</w:t>
+            </w:r>
+          </w:p>
+        </w:tc>
+        <w:tc>
+          <w:tcPr>
+            <w:tcW w:type="dxa" w:w="1728"/>
+          </w:tcPr>
+          <w:p>
+            <w:r>
+              <w:t>Reduced intervention actions; per-class F1 not reported</w:t>
+            </w:r>
+          </w:p>
+        </w:tc>
+        <w:tc>
+          <w:tcPr>
+            <w:tcW w:type="dxa" w:w="1728"/>
+          </w:tcPr>
+          <w:p>
+            <w:r>
+              <w:t>Customer-level aggregation; no line-item granularity</w:t>
+            </w:r>
+          </w:p>
+        </w:tc>
+      </w:tr>
+    </w:tbl>
+    <w:p>
+      <w:pPr>
+        <w:pStyle w:val="ThesisParagraphText"/>
+      </w:pPr>
+      <w:r>
+        <w:t>Two patterns emerge from Table 1.1. Across studies, predictive accuracy clusters around 80–85% for binary or coarse multi-class formulations, yet none of the cited works decomposes performance across ordered delay brackets, and none operates at the granularity of individual fee categories. These omissions motivate the granular, ordinal, and multi-stage design benchmarked in this study.</w:t>
+      </w:r>
+    </w:p>
+    <w:p>
+      <w:pPr>
         <w:pStyle w:val="Heading2"/>
         <w:numPr>
           <w:ilvl w:val="1"/>
           <w:numId w:val="20"/>
         </w:numPr>
       </w:pPr>
-      <w:bookmarkStart w:id="22" w:name="_Toc229345122"/>
-      <w:r>
-        <w:t>Context of the Study</w:t>
-      </w:r>
-      <w:bookmarkEnd w:id="22"/>
+      <w:r>
+        <w:t>1.1 Context of the Study</w:t>
+      </w:r>
     </w:p>
     <w:p>
       <w:pPr>
@@ -5199,11 +5579,9 @@
           <w:numId w:val="20"/>
         </w:numPr>
       </w:pPr>
-      <w:bookmarkStart w:id="23" w:name="_Toc229345123"/>
-      <w:r>
-        <w:t>The Problem, Gap, or Opportunity</w:t>
-      </w:r>
-      <w:bookmarkEnd w:id="23"/>
+      <w:r>
+        <w:t>1.2 The Problem, Gap, or Opportunity</w:t>
+      </w:r>
     </w:p>
     <w:p>
       <w:pPr>
@@ -5267,12 +5645,9 @@
           <w:numId w:val="20"/>
         </w:numPr>
       </w:pPr>
-      <w:bookmarkStart w:id="24" w:name="_Toc229345124"/>
-      <w:r>
-        <w:lastRenderedPageBreak/>
-        <w:t>Research Questions</w:t>
-      </w:r>
-      <w:bookmarkEnd w:id="24"/>
+      <w:r>
+        <w:t>1.3 Research Questions</w:t>
+      </w:r>
     </w:p>
     <w:p>
       <w:pPr>
@@ -5418,12 +5793,57 @@
       <w:pPr>
         <w:pStyle w:val="Heading2"/>
       </w:pPr>
-      <w:bookmarkStart w:id="26" w:name="_Toc229345126"/>
-      <w:r>
-        <w:lastRenderedPageBreak/>
-        <w:t>1.5 Scope and Limitations</w:t>
-      </w:r>
-      <w:bookmarkEnd w:id="26"/>
+      <w:r>
+        <w:t>1.5 Significance of the Study</w:t>
+      </w:r>
+    </w:p>
+    <w:p>
+      <w:pPr>
+        <w:pStyle w:val="ThesisParagraphText"/>
+      </w:pPr>
+      <w:r>
+        <w:t>This study offers direct operational value to the partner institution. The bad-debt and collection trends documented in Table 2.1 — bad debts expense rising from PHP 248,650 in school year 2019 to PHP 352,075 in 2025, with Days Sales Outstanding persisting between 36 and 49 days in recent years — indicate that reactive collection practices have not contained receivable risk. By predicting the payment bracket of every invoice at issuance, the system enables finance officers to anticipate cash shortfalls, to target reminders and restructuring offers before due dates lapse, and to reduce bad-debt exposure by shifting from reactive to proactive cash flow management. Beyond the partner school, the framework is transferable to Philippine private schools broadly: such institutions share substantially similar installment-billing structures and operate under the same enforcement constraints imposed by Republic Act 11984 [7], so any school capable of exporting standard revenue and enrollment records can retrain the pipeline on its own data without architectural modification.</w:t>
+      </w:r>
+    </w:p>
+    <w:p>
+      <w:pPr>
+        <w:pStyle w:val="ThesisParagraphText"/>
+      </w:pPr>
+      <w:r>
+        <w:t>For the academic community, this is the first study to benchmark ordinal classifiers and two-stage ensemble architectures specifically for the educational Invoice Payment Prediction Problem, directly addressing the methodological gaps identified in Schoonbee et al. [8] and Moore and van Vuuren [4]. For data science practice more generally, the study demonstrates that survival-analysis feature engineering has conditional rather than universal utility: Cox-derived hazard features improve distance-based and probabilistic learners while adding redundant or noisy signal to high-capacity tree ensembles. This finding carries implications beyond the IPPP, suggesting that feature engineering effort should be allocated according to the inductive capacity of the downstream learner rather than applied uniformly across model families.</w:t>
+      </w:r>
+    </w:p>
+    <w:p>
+      <w:pPr>
+        <w:pStyle w:val="Heading2"/>
+      </w:pPr>
+      <w:r>
+        <w:t>1.6 Alignment with United Nations Sustainable Development Goals</w:t>
+      </w:r>
+    </w:p>
+    <w:p>
+      <w:pPr>
+        <w:pStyle w:val="ThesisParagraphText"/>
+      </w:pPr>
+      <w:r>
+        <w:t>This research contributes to several of the United Nations Sustainable Development Goals (SDGs) articulated in the 2030 Agenda for Sustainable Development [47]. With respect to SDG 4 (Quality Education), the prediction system protects an institution's capacity to deliver quality education by helping it maintain financial sustainability: schools facing cash flow crises may be forced to cut staff, reduce learning resources, or close programs, so proactive receivables management directly protects educational continuity. With respect to SDG 8 (Decent Work and Economic Growth), predictive accounts-receivable management reduces financial uncertainty for small and medium-sized private educational institutions, supporting their role as employers and contributors to local economic activity.</w:t>
+      </w:r>
+    </w:p>
+    <w:p>
+      <w:pPr>
+        <w:pStyle w:val="ThesisParagraphText"/>
+      </w:pPr>
+      <w:r>
+        <w:t>The study likewise advances SDG 10 (Reduced Inequalities), because the model enables schools to identify at-risk families earlier and to offer targeted payment assistance — installment restructuring or referral for social welfare certification — rather than punitive enforcement, consistent with the equity-oriented intent of Republic Act 11984 [7]. With respect to SDG 16 (Peace, Justice, and Strong Institutions), the use of pseudonymized data, compliance with the Data Privacy Act of 2012, and a transparent, fully logged machine learning methodology demonstrate responsible institutional governance and data stewardship. Finally, in support of SDG 17 (Partnerships for the Goals), the open benchmarking framework and the accompanying web prototype are designed to be replicable by other institutions, supporting knowledge sharing and institutional capacity building across the sector.</w:t>
+      </w:r>
+    </w:p>
+    <w:p>
+      <w:pPr>
+        <w:pStyle w:val="Heading2"/>
+      </w:pPr>
+      <w:r>
+        <w:t>1.7 Scope and Limitations</w:t>
+      </w:r>
     </w:p>
     <w:p>
       <w:pPr>
@@ -5440,40 +5860,7 @@
         <w:ind w:firstLine="720"/>
       </w:pPr>
       <w:r>
-        <w:t xml:space="preserve">Limitations include: </w:t>
-      </w:r>
-      <w:r>
-        <w:rPr>
-          <w:b/>
-          <w:bCs/>
-        </w:rPr>
-        <w:t>(1)</w:t>
-      </w:r>
-      <w:r>
-        <w:t xml:space="preserve"> The study uses data from a single institution, which may limit generalizability to schools with significantly different demographic or socioeconomic profiles; </w:t>
-      </w:r>
-      <w:r>
-        <w:rPr>
-          <w:b/>
-          <w:bCs/>
-        </w:rPr>
-        <w:t>(2)</w:t>
-      </w:r>
-      <w:r>
-        <w:t xml:space="preserve"> The predictive models are trained on historical journal entries and do not account for real-time external economic shocks (e.g., localized inflation or specific family crises) not captured in the pseudonymized financial records; and </w:t>
-      </w:r>
-      <w:r>
-        <w:rPr>
-          <w:b/>
-          <w:bCs/>
-        </w:rPr>
-        <w:t xml:space="preserve">(3) </w:t>
-      </w:r>
-      <w:r>
-        <w:t>The survival features are derived from a Cox Proportional Hazards model, which assumes a linear relationship between features and the log-hazard, potentially missing non-linear temporal interactions.</w:t>
-      </w:r>
-      <w:r>
-        <w:br w:type="page"/>
+        <w:t>Several limitations bound the interpretation of these results. The study draws on data from a single institution, which may limit generalizability to schools with significantly different demographic or socioeconomic profiles. The predictive models are trained on historical journal entries and therefore cannot account for real-time external economic shocks, such as localized inflation or family-level crises, that are not captured in the pseudonymized financial records. Finally, the survival features are derived from a Cox Proportional Hazards model, which assumes a linear relationship between covariates and the log-hazard and may consequently miss non-linear temporal interactions.</w:t>
       </w:r>
     </w:p>
     <w:p>

</xml_diff>

<commit_message>
docs(ch5): expand Future Directions and add 5.5 Conclusion
Tasks 5.1-5.2 of THESIS_REVISION_PLAN.md:
- Expand 5.4 into six concrete directions: SHAP explainability,
  time-varying Cox covariates, federated learning, Dash prototype
  extension (Kaggle dataset adapter per Sections 4.6/4.7), public
  AR/invoice dataset testing, and annual Cox recalibration cadence
- Add 5.5 Conclusion (~450 words): states what was demonstrated,
  translates F1 = 0.60 into operational terms for the partner school,
  frames the replicable benchmarking methodology, and closes on
  governance and educational equity

Co-Authored-By: Claude Fable 5 <noreply@anthropic.com>
</commit_message>
<xml_diff>
--- a/Beley-Reyes_Thesis2-ACM.docx
+++ b/Beley-Reyes_Thesis2-ACM.docx
@@ -19936,7 +19936,7 @@
         <w:pStyle w:val="ThesisParagraphText"/>
       </w:pPr>
       <w:r>
-        <w:t>Future research should explore: (1) the inclusion of time-varying covariates within the Cox model as partial payments are received; (2) the integration of explainable AI layers (e.g., SHAP) to increase administrative trust in individual high-risk predictions; and (3) multi-institution federated learning to improve model generalizability while preserving student data privacy.</w:t>
+        <w:t>Future research and development should proceed along six directions. First, explainable AI integration: a SHAP value layer over the deployed two-stage model would let administrators see why an individual invoice is flagged as high risk, increasing the administrative trust on which adoption depends. Second, time-varying covariates within the Cox model would allow hazard estimates to update as partial payments arrive during the term, rather than fixing survival features at invoice issuance. Third, multi-institution federated learning would improve model generalizability while preserving student data privacy, since schools could train shared models without exchanging raw records. Fourth, the Dash prototype should be extended beyond its MVP scope — most notably through the Kaggle dataset compatibility adapter described in Sections 4.6 and 4.7, a mapping layer that would translate external invoice schemas onto the input format expected by the feature engineering pipeline, together with additional data source integrations beyond the three-file institutional export. Fifth, and enabled by that adapter, the pipeline should be tested on publicly available accounts-receivable and invoice datasets to establish generalizability beyond the partner institution. Finally, deployments should adopt the retraining cadence recommended in Section 5.3: an annual recalibration of the Cox PH model and downstream classifiers, so that survival features and decision thresholds continue to track each new cohort's payment behavior.</w:t>
       </w:r>
     </w:p>
     <w:p>
@@ -19955,6 +19955,46 @@
       </w:pPr>
       <w:r>
         <w:br w:type="page"/>
+      </w:r>
+    </w:p>
+    <w:p>
+      <w:pPr>
+        <w:pStyle w:val="Heading2"/>
+      </w:pPr>
+      <w:r>
+        <w:t>5.5 Conclusion</w:t>
+      </w:r>
+    </w:p>
+    <w:p>
+      <w:pPr>
+        <w:pStyle w:val="ThesisParagraphText"/>
+      </w:pPr>
+      <w:r>
+        <w:t>This study demonstrated that hierarchical ensemble decomposition is a viable architectural paradigm for the Invoice Payment Prediction Problem, outperforming both ordinal classifiers and single-stage baselines across the majority of resampling and feature regimes tested. Across 1,092 controlled configurations, the two-stage XGBoost-to-AdaBoost pipeline established the performance ceiling at a macro-F1 of 0.6003 and ROC-AUC of 0.8919, and the experiments further demonstrated two structural results: that granular, line-item behavioral features — a student's previous bracket, weighted payment history, and carried balance — are the dominant predictive signal, and that survival-analysis feature engineering has conditional rather than universal utility, helping probabilistic and distance-based learners while adding little to high-capacity tree ensembles.</w:t>
+      </w:r>
+    </w:p>
+    <w:p>
+      <w:pPr>
+        <w:pStyle w:val="ThesisParagraphText"/>
+      </w:pPr>
+      <w:r>
+        <w:t>These numbers have a concrete operational meaning for the partner school, connecting back to the significance articulated in Section 1.5. A macro-F1 of 0.60 on a four-class, heavily imbalanced problem means that if one hundred invoices fall due next month, the model places roughly sixty of the eventually-late ones in their correct delay bracket, and the confusion analysis in Section 4.4 shows that most of its remaining errors land in adjacent brackets rather than at the opposite extreme. Measured against the status quo — no forward visibility into receivables at all — this allows the finance office to concentrate outreach on the highest-risk invoices before due dates lapse: earlier reminders, proactive restructuring offers, and social welfare referrals, in place of after-the-fact collection that RA 11984 has rendered largely unenforceable. Prediction, in other words, converts bad-debt exposure into earlier and gentler intervention.</w:t>
+      </w:r>
+    </w:p>
+    <w:p>
+      <w:pPr>
+        <w:pStyle w:val="ThesisParagraphText"/>
+      </w:pPr>
+      <w:r>
+        <w:t>Beyond the single institution, the contribution is methodological. The study leaves behind a replicable benchmarking framework — a factorial protocol over model families, balancing strategies, and feature regimes, with every experiment logged to a queryable results store — together with a working prototype that operationalizes the winning configuration. Any institution facing the IPPP, educational or otherwise, can rerun the same protocol on its own records and obtain a defensible, evidence-based model selection rather than an imported assumption about what works.</w:t>
+      </w:r>
+    </w:p>
+    <w:p>
+      <w:pPr>
+        <w:pStyle w:val="ThesisParagraphText"/>
+      </w:pPr>
+      <w:r>
+        <w:t>Predictive receivables management, finally, should be read as an instrument of institutional responsibility rather than financial surveillance. A school that can see payment difficulty coming can keep its programs funded without leaning on enforcement mechanisms the law has rightly removed, and can direct assistance to the families who need it while there is still time to help. In aligning financial sustainability with educational equity, this study argues, predictive analytics becomes part of responsible governance — and the gap between what schools can know and what they currently act on is precisely where data science has the most to offer.</w:t>
       </w:r>
     </w:p>
     <w:p>

</xml_diff>

<commit_message>
docs(appendices): page breaks, DSO commentary, Appendix G and H
Tasks 6.1-6.4 of THESIS_REVISION_PLAN.md:
- Page break before every appendix heading (A-H) so each starts on its
  own page
- Appendices A-C: intro paragraph defining DSO per plan type and an
  observation paragraph (consolidated three-year analysis after C)
- New Appendix G: institutional authorization letter placeholder
  ("Letter on file - co-author to provide") describing required contents
- New Appendix H: dataset description (11,440 raw -> 6,527 labeled,
  2019-2025, three source tables) and a 44-variable dictionary table
  (Feature | Category | Type | Description | Source) from
  FEATURE_REFERENCE.md, plus data-availability note

Co-Authored-By: Claude Fable 5 <noreply@anthropic.com>
</commit_message>
<xml_diff>
--- a/Beley-Reyes_Thesis2-ACM.docx
+++ b/Beley-Reyes_Thesis2-ACM.docx
@@ -20014,6 +20014,7 @@
     </w:p>
     <w:p>
       <w:pPr>
+        <w:pageBreakBefore/>
         <w:pStyle w:val="Heading2"/>
       </w:pPr>
       <w:bookmarkStart w:id="127" w:name="_Toc229345160"/>
@@ -20027,6 +20028,14 @@
         <w:t>)</w:t>
       </w:r>
       <w:bookmarkEnd w:id="127"/>
+    </w:p>
+    <w:p>
+      <w:pPr>
+        <w:pStyle w:val="ThesisParagraphText"/>
+      </w:pPr>
+      <w:r>
+        <w:t>Appendix A presents the Days Sales Outstanding (DSO) per payment plan type for calendar year 2023. DSO is computed as the average number of days between invoice due date and full settlement, segmented by the student's chosen installment plan (A through E, or none).</w:t>
+      </w:r>
     </w:p>
     <w:p>
       <w:pPr>
@@ -20088,6 +20097,15 @@
     </w:p>
     <w:p>
       <w:pPr>
+        <w:pStyle w:val="ThesisParagraphText"/>
+      </w:pPr>
+      <w:r>
+        <w:t>The figure shows the same plan-level ordering observed across all three reported years: longer credit windows correspond to higher DSO. A consolidated observation across Appendices A–C follows the final figure in Appendix C.</w:t>
+      </w:r>
+    </w:p>
+    <w:p>
+      <w:pPr>
+        <w:pageBreakBefore/>
         <w:pStyle w:val="Heading2"/>
       </w:pPr>
       <w:bookmarkStart w:id="128" w:name="_Toc229345161"/>
@@ -20095,6 +20113,14 @@
         <w:t>APPENDIX B: Days Sales Outstanding per Plan Type (calendar year 2024)</w:t>
       </w:r>
       <w:bookmarkEnd w:id="128"/>
+    </w:p>
+    <w:p>
+      <w:pPr>
+        <w:pStyle w:val="ThesisParagraphText"/>
+      </w:pPr>
+      <w:r>
+        <w:t>Appendix B presents the Days Sales Outstanding (DSO) per payment plan type for calendar year 2024. DSO is computed as the average number of days between invoice due date and full settlement, segmented by the student's chosen installment plan (A through E, or none).</w:t>
+      </w:r>
     </w:p>
     <w:p>
       <w:pPr>
@@ -20158,11 +20184,20 @@
     <w:p>
       <w:pPr>
         <w:pStyle w:val="ThesisParagraphText"/>
+      </w:pPr>
+      <w:r>
+        <w:t>The figure shows the same plan-level ordering observed across all three reported years: longer credit windows correspond to higher DSO. A consolidated observation across Appendices A–C follows the final figure in Appendix C.</w:t>
+      </w:r>
+    </w:p>
+    <w:p>
+      <w:pPr>
+        <w:pStyle w:val="ThesisParagraphText"/>
         <w:ind w:firstLine="0"/>
       </w:pPr>
     </w:p>
     <w:p>
       <w:pPr>
+        <w:pageBreakBefore/>
         <w:pStyle w:val="Heading2"/>
       </w:pPr>
       <w:bookmarkStart w:id="129" w:name="_Toc229345162"/>
@@ -20171,6 +20206,14 @@
         <w:t>APPENDIX C: Days Sales Outstanding per Plan Type (calendar year 2025)</w:t>
       </w:r>
       <w:bookmarkEnd w:id="129"/>
+    </w:p>
+    <w:p>
+      <w:pPr>
+        <w:pStyle w:val="ThesisParagraphText"/>
+      </w:pPr>
+      <w:r>
+        <w:t>Appendix C presents the Days Sales Outstanding (DSO) per payment plan type for calendar year 2025. DSO is computed as the average number of days between invoice due date and full settlement, segmented by the student's chosen installment plan (A through E, or none).</w:t>
+      </w:r>
     </w:p>
     <w:p>
       <w:pPr>
@@ -20233,6 +20276,15 @@
     </w:p>
     <w:p>
       <w:pPr>
+        <w:pStyle w:val="ThesisParagraphText"/>
+      </w:pPr>
+      <w:r>
+        <w:t>Across the three years presented in Appendices A through C, the plan types that extend the longest credit windows — the extended monthly installment arrangements and invoices with no assigned plan — consistently exhibit the highest DSO, while Plan A (full upfront payment) settles fastest. The implication is that settlement speed tracks the length of the credit window a plan extends: the more payment is deferred, the longer receivables remain outstanding. This ordering is consistent with the ordinal plan-risk encoding used as a model feature (Section 3.3), and it explains why plan-type variables carry predictive signal in the payment-bracket models.</w:t>
+      </w:r>
+    </w:p>
+    <w:p>
+      <w:pPr>
+        <w:pageBreakBefore/>
         <w:pStyle w:val="Heading2"/>
       </w:pPr>
       <w:bookmarkStart w:id="130" w:name="_Toc229345163"/>
@@ -20313,6 +20365,7 @@
     </w:p>
     <w:p>
       <w:pPr>
+        <w:pageBreakBefore/>
         <w:pStyle w:val="Heading2"/>
         <w:spacing w:before="0" w:after="0"/>
       </w:pPr>
@@ -20377,6 +20430,7 @@
     </w:p>
     <w:p>
       <w:pPr>
+        <w:pageBreakBefore/>
         <w:pStyle w:val="Heading2"/>
         <w:spacing w:before="0" w:after="0"/>
         <w:rPr>
@@ -20463,6 +20517,2418 @@
       </w:pPr>
       <w:r>
         <w:br w:type="page"/>
+      </w:r>
+    </w:p>
+    <w:p>
+      <w:pPr>
+        <w:pageBreakBefore/>
+        <w:pStyle w:val="Heading2"/>
+      </w:pPr>
+      <w:r>
+        <w:t>APPENDIX G: Institutional Communication and Authorization Letter</w:t>
+      </w:r>
+    </w:p>
+    <w:p>
+      <w:pPr>
+        <w:pStyle w:val="ThesisParagraphText"/>
+      </w:pPr>
+      <w:r>
+        <w:t>Letter on file — co-author to provide. This appendix contains the written authorization from the partner institution permitting the research team to access and process student financial records for the purposes of this study, subject to the conditions described in Section 3.7.1. The letter is issued on the school's letterhead and signed by an authorized signatory, and it specifies the scope of data access granted, the restrictions on data use (research purposes only, mandatory pseudonymization, and no public release of raw records), and the date of authorization. This communication is distinct from any non-disclosure agreement: it constitutes the school's formal authorization to use its data for research.</w:t>
+      </w:r>
+    </w:p>
+    <w:p>
+      <w:pPr>
+        <w:pageBreakBefore/>
+        <w:pStyle w:val="Heading2"/>
+      </w:pPr>
+      <w:r>
+        <w:t>APPENDIX H: Dataset Description and Variable Dictionary</w:t>
+      </w:r>
+    </w:p>
+    <w:p>
+      <w:pPr>
+        <w:pStyle w:val="ThesisParagraphText"/>
+      </w:pPr>
+      <w:r>
+        <w:t>The pseudonymized dataset comprises 11,440 raw invoice records exported from the partner institution's ERP system, of which 6,527 labeled records were retained for modeling after filtering for sufficient payment history. Records span academic years 2019–2025, with payment activity observed through March 31, 2026, and originate from three source tables: revenues (itemized receivables and payments), enrollees (per-year enrollment and installment plan), and the chart of accounts (category classifications). The table below lists every variable used in the machine learning pipeline, its category, type, description, and source.</w:t>
+      </w:r>
+    </w:p>
+    <w:tbl>
+      <w:tblPr>
+        <w:tblStyle w:val="TableGrid"/>
+        <w:tblW w:type="auto" w:w="0"/>
+        <w:tblLayout w:type="autofit"/>
+        <w:tblLook w:firstColumn="1" w:firstRow="1" w:lastColumn="0" w:lastRow="0" w:noHBand="0" w:noVBand="1" w:val="04A0"/>
+      </w:tblPr>
+      <w:tblGrid>
+        <w:gridCol w:w="1728"/>
+        <w:gridCol w:w="1728"/>
+        <w:gridCol w:w="1728"/>
+        <w:gridCol w:w="1728"/>
+        <w:gridCol w:w="1728"/>
+      </w:tblGrid>
+      <w:tr>
+        <w:tc>
+          <w:tcPr>
+            <w:tcW w:type="dxa" w:w="1728"/>
+          </w:tcPr>
+          <w:p>
+            <w:r>
+              <w:rPr>
+                <w:b/>
+              </w:rPr>
+              <w:t>Feature Name</w:t>
+            </w:r>
+          </w:p>
+        </w:tc>
+        <w:tc>
+          <w:tcPr>
+            <w:tcW w:type="dxa" w:w="1728"/>
+          </w:tcPr>
+          <w:p>
+            <w:r>
+              <w:rPr>
+                <w:b/>
+              </w:rPr>
+              <w:t>Category</w:t>
+            </w:r>
+          </w:p>
+        </w:tc>
+        <w:tc>
+          <w:tcPr>
+            <w:tcW w:type="dxa" w:w="1728"/>
+          </w:tcPr>
+          <w:p>
+            <w:r>
+              <w:rPr>
+                <w:b/>
+              </w:rPr>
+              <w:t>Type</w:t>
+            </w:r>
+          </w:p>
+        </w:tc>
+        <w:tc>
+          <w:tcPr>
+            <w:tcW w:type="dxa" w:w="1728"/>
+          </w:tcPr>
+          <w:p>
+            <w:r>
+              <w:rPr>
+                <w:b/>
+              </w:rPr>
+              <w:t>Description</w:t>
+            </w:r>
+          </w:p>
+        </w:tc>
+        <w:tc>
+          <w:tcPr>
+            <w:tcW w:type="dxa" w:w="1728"/>
+          </w:tcPr>
+          <w:p>
+            <w:r>
+              <w:rPr>
+                <w:b/>
+              </w:rPr>
+              <w:t>Source</w:t>
+            </w:r>
+          </w:p>
+        </w:tc>
+      </w:tr>
+      <w:tr>
+        <w:tc>
+          <w:tcPr>
+            <w:tcW w:type="dxa" w:w="1728"/>
+          </w:tcPr>
+          <w:p>
+            <w:r>
+              <w:t>school_year</w:t>
+            </w:r>
+          </w:p>
+        </w:tc>
+        <w:tc>
+          <w:tcPr>
+            <w:tcW w:type="dxa" w:w="1728"/>
+          </w:tcPr>
+          <w:p>
+            <w:r>
+              <w:t>Identity (not a model input)</w:t>
+            </w:r>
+          </w:p>
+        </w:tc>
+        <w:tc>
+          <w:tcPr>
+            <w:tcW w:type="dxa" w:w="1728"/>
+          </w:tcPr>
+          <w:p>
+            <w:r>
+              <w:t>Categorical</w:t>
+            </w:r>
+          </w:p>
+        </w:tc>
+        <w:tc>
+          <w:tcPr>
+            <w:tcW w:type="dxa" w:w="1728"/>
+          </w:tcPr>
+          <w:p>
+            <w:r>
+              <w:t>Academic year of the invoice</w:t>
+            </w:r>
+          </w:p>
+        </w:tc>
+        <w:tc>
+          <w:tcPr>
+            <w:tcW w:type="dxa" w:w="1728"/>
+          </w:tcPr>
+          <w:p>
+            <w:r>
+              <w:t>Revenues</w:t>
+            </w:r>
+          </w:p>
+        </w:tc>
+      </w:tr>
+      <w:tr>
+        <w:tc>
+          <w:tcPr>
+            <w:tcW w:type="dxa" w:w="1728"/>
+          </w:tcPr>
+          <w:p>
+            <w:r>
+              <w:t>student_id_pseudonymized</w:t>
+            </w:r>
+          </w:p>
+        </w:tc>
+        <w:tc>
+          <w:tcPr>
+            <w:tcW w:type="dxa" w:w="1728"/>
+          </w:tcPr>
+          <w:p>
+            <w:r>
+              <w:t>Identity (not a model input)</w:t>
+            </w:r>
+          </w:p>
+        </w:tc>
+        <w:tc>
+          <w:tcPr>
+            <w:tcW w:type="dxa" w:w="1728"/>
+          </w:tcPr>
+          <w:p>
+            <w:r>
+              <w:t>Integer</w:t>
+            </w:r>
+          </w:p>
+        </w:tc>
+        <w:tc>
+          <w:tcPr>
+            <w:tcW w:type="dxa" w:w="1728"/>
+          </w:tcPr>
+          <w:p>
+            <w:r>
+              <w:t>Anonymized student identifier</w:t>
+            </w:r>
+          </w:p>
+        </w:tc>
+        <w:tc>
+          <w:tcPr>
+            <w:tcW w:type="dxa" w:w="1728"/>
+          </w:tcPr>
+          <w:p>
+            <w:r>
+              <w:t>Revenues (pseudonymized)</w:t>
+            </w:r>
+          </w:p>
+        </w:tc>
+      </w:tr>
+      <w:tr>
+        <w:tc>
+          <w:tcPr>
+            <w:tcW w:type="dxa" w:w="1728"/>
+          </w:tcPr>
+          <w:p>
+            <w:r>
+              <w:t>category_name</w:t>
+            </w:r>
+          </w:p>
+        </w:tc>
+        <w:tc>
+          <w:tcPr>
+            <w:tcW w:type="dxa" w:w="1728"/>
+          </w:tcPr>
+          <w:p>
+            <w:r>
+              <w:t>Identity (not a model input)</w:t>
+            </w:r>
+          </w:p>
+        </w:tc>
+        <w:tc>
+          <w:tcPr>
+            <w:tcW w:type="dxa" w:w="1728"/>
+          </w:tcPr>
+          <w:p>
+            <w:r>
+              <w:t>Categorical</w:t>
+            </w:r>
+          </w:p>
+        </w:tc>
+        <w:tc>
+          <w:tcPr>
+            <w:tcW w:type="dxa" w:w="1728"/>
+          </w:tcPr>
+          <w:p>
+            <w:r>
+              <w:t>Fee category (e.g., tuition, miscellaneous)</w:t>
+            </w:r>
+          </w:p>
+        </w:tc>
+        <w:tc>
+          <w:tcPr>
+            <w:tcW w:type="dxa" w:w="1728"/>
+          </w:tcPr>
+          <w:p>
+            <w:r>
+              <w:t>Chart of accounts</w:t>
+            </w:r>
+          </w:p>
+        </w:tc>
+      </w:tr>
+      <w:tr>
+        <w:tc>
+          <w:tcPr>
+            <w:tcW w:type="dxa" w:w="1728"/>
+          </w:tcPr>
+          <w:p>
+            <w:r>
+              <w:t>gross_receivables</w:t>
+            </w:r>
+          </w:p>
+        </w:tc>
+        <w:tc>
+          <w:tcPr>
+            <w:tcW w:type="dxa" w:w="1728"/>
+          </w:tcPr>
+          <w:p>
+            <w:r>
+              <w:t>Raw financial</w:t>
+            </w:r>
+          </w:p>
+        </w:tc>
+        <w:tc>
+          <w:tcPr>
+            <w:tcW w:type="dxa" w:w="1728"/>
+          </w:tcPr>
+          <w:p>
+            <w:r>
+              <w:t>Numeric</w:t>
+            </w:r>
+          </w:p>
+        </w:tc>
+        <w:tc>
+          <w:tcPr>
+            <w:tcW w:type="dxa" w:w="1728"/>
+          </w:tcPr>
+          <w:p>
+            <w:r>
+              <w:t>Total billed amount before deductions</w:t>
+            </w:r>
+          </w:p>
+        </w:tc>
+        <w:tc>
+          <w:tcPr>
+            <w:tcW w:type="dxa" w:w="1728"/>
+          </w:tcPr>
+          <w:p>
+            <w:r>
+              <w:t>Revenues</w:t>
+            </w:r>
+          </w:p>
+        </w:tc>
+      </w:tr>
+      <w:tr>
+        <w:tc>
+          <w:tcPr>
+            <w:tcW w:type="dxa" w:w="1728"/>
+          </w:tcPr>
+          <w:p>
+            <w:r>
+              <w:t>amount_discounted</w:t>
+            </w:r>
+          </w:p>
+        </w:tc>
+        <w:tc>
+          <w:tcPr>
+            <w:tcW w:type="dxa" w:w="1728"/>
+          </w:tcPr>
+          <w:p>
+            <w:r>
+              <w:t>Raw financial</w:t>
+            </w:r>
+          </w:p>
+        </w:tc>
+        <w:tc>
+          <w:tcPr>
+            <w:tcW w:type="dxa" w:w="1728"/>
+          </w:tcPr>
+          <w:p>
+            <w:r>
+              <w:t>Numeric</w:t>
+            </w:r>
+          </w:p>
+        </w:tc>
+        <w:tc>
+          <w:tcPr>
+            <w:tcW w:type="dxa" w:w="1728"/>
+          </w:tcPr>
+          <w:p>
+            <w:r>
+              <w:t>Discount applied to the invoice</w:t>
+            </w:r>
+          </w:p>
+        </w:tc>
+        <w:tc>
+          <w:tcPr>
+            <w:tcW w:type="dxa" w:w="1728"/>
+          </w:tcPr>
+          <w:p>
+            <w:r>
+              <w:t>Revenues</w:t>
+            </w:r>
+          </w:p>
+        </w:tc>
+      </w:tr>
+      <w:tr>
+        <w:tc>
+          <w:tcPr>
+            <w:tcW w:type="dxa" w:w="1728"/>
+          </w:tcPr>
+          <w:p>
+            <w:r>
+              <w:t>adjustments</w:t>
+            </w:r>
+          </w:p>
+        </w:tc>
+        <w:tc>
+          <w:tcPr>
+            <w:tcW w:type="dxa" w:w="1728"/>
+          </w:tcPr>
+          <w:p>
+            <w:r>
+              <w:t>Raw financial</w:t>
+            </w:r>
+          </w:p>
+        </w:tc>
+        <w:tc>
+          <w:tcPr>
+            <w:tcW w:type="dxa" w:w="1728"/>
+          </w:tcPr>
+          <w:p>
+            <w:r>
+              <w:t>Numeric</w:t>
+            </w:r>
+          </w:p>
+        </w:tc>
+        <w:tc>
+          <w:tcPr>
+            <w:tcW w:type="dxa" w:w="1728"/>
+          </w:tcPr>
+          <w:p>
+            <w:r>
+              <w:t>Post-billing adjustments (credit or debit)</w:t>
+            </w:r>
+          </w:p>
+        </w:tc>
+        <w:tc>
+          <w:tcPr>
+            <w:tcW w:type="dxa" w:w="1728"/>
+          </w:tcPr>
+          <w:p>
+            <w:r>
+              <w:t>Revenues</w:t>
+            </w:r>
+          </w:p>
+        </w:tc>
+      </w:tr>
+      <w:tr>
+        <w:tc>
+          <w:tcPr>
+            <w:tcW w:type="dxa" w:w="1728"/>
+          </w:tcPr>
+          <w:p>
+            <w:r>
+              <w:t>credit_sale_amount</w:t>
+            </w:r>
+          </w:p>
+        </w:tc>
+        <w:tc>
+          <w:tcPr>
+            <w:tcW w:type="dxa" w:w="1728"/>
+          </w:tcPr>
+          <w:p>
+            <w:r>
+              <w:t>Raw financial</w:t>
+            </w:r>
+          </w:p>
+        </w:tc>
+        <w:tc>
+          <w:tcPr>
+            <w:tcW w:type="dxa" w:w="1728"/>
+          </w:tcPr>
+          <w:p>
+            <w:r>
+              <w:t>Numeric</w:t>
+            </w:r>
+          </w:p>
+        </w:tc>
+        <w:tc>
+          <w:tcPr>
+            <w:tcW w:type="dxa" w:w="1728"/>
+          </w:tcPr>
+          <w:p>
+            <w:r>
+              <w:t>Net receivable after discount and adjustments</w:t>
+            </w:r>
+          </w:p>
+        </w:tc>
+        <w:tc>
+          <w:tcPr>
+            <w:tcW w:type="dxa" w:w="1728"/>
+          </w:tcPr>
+          <w:p>
+            <w:r>
+              <w:t>Derived</w:t>
+            </w:r>
+          </w:p>
+        </w:tc>
+      </w:tr>
+      <w:tr>
+        <w:tc>
+          <w:tcPr>
+            <w:tcW w:type="dxa" w:w="1728"/>
+          </w:tcPr>
+          <w:p>
+            <w:r>
+              <w:t>due_date</w:t>
+            </w:r>
+          </w:p>
+        </w:tc>
+        <w:tc>
+          <w:tcPr>
+            <w:tcW w:type="dxa" w:w="1728"/>
+          </w:tcPr>
+          <w:p>
+            <w:r>
+              <w:t>Raw financial</w:t>
+            </w:r>
+          </w:p>
+        </w:tc>
+        <w:tc>
+          <w:tcPr>
+            <w:tcW w:type="dxa" w:w="1728"/>
+          </w:tcPr>
+          <w:p>
+            <w:r>
+              <w:t>Date</w:t>
+            </w:r>
+          </w:p>
+        </w:tc>
+        <w:tc>
+          <w:tcPr>
+            <w:tcW w:type="dxa" w:w="1728"/>
+          </w:tcPr>
+          <w:p>
+            <w:r>
+              <w:t>Contractual payment due date</w:t>
+            </w:r>
+          </w:p>
+        </w:tc>
+        <w:tc>
+          <w:tcPr>
+            <w:tcW w:type="dxa" w:w="1728"/>
+          </w:tcPr>
+          <w:p>
+            <w:r>
+              <w:t>Revenues</w:t>
+            </w:r>
+          </w:p>
+        </w:tc>
+      </w:tr>
+      <w:tr>
+        <w:tc>
+          <w:tcPr>
+            <w:tcW w:type="dxa" w:w="1728"/>
+          </w:tcPr>
+          <w:p>
+            <w:r>
+              <w:t>date_fully_paid</w:t>
+            </w:r>
+          </w:p>
+        </w:tc>
+        <w:tc>
+          <w:tcPr>
+            <w:tcW w:type="dxa" w:w="1728"/>
+          </w:tcPr>
+          <w:p>
+            <w:r>
+              <w:t>Raw financial</w:t>
+            </w:r>
+          </w:p>
+        </w:tc>
+        <w:tc>
+          <w:tcPr>
+            <w:tcW w:type="dxa" w:w="1728"/>
+          </w:tcPr>
+          <w:p>
+            <w:r>
+              <w:t>Date</w:t>
+            </w:r>
+          </w:p>
+        </w:tc>
+        <w:tc>
+          <w:tcPr>
+            <w:tcW w:type="dxa" w:w="1728"/>
+          </w:tcPr>
+          <w:p>
+            <w:r>
+              <w:t>Date the invoice was fully settled (empty if unpaid)</w:t>
+            </w:r>
+          </w:p>
+        </w:tc>
+        <w:tc>
+          <w:tcPr>
+            <w:tcW w:type="dxa" w:w="1728"/>
+          </w:tcPr>
+          <w:p>
+            <w:r>
+              <w:t>Revenues</w:t>
+            </w:r>
+          </w:p>
+        </w:tc>
+      </w:tr>
+      <w:tr>
+        <w:tc>
+          <w:tcPr>
+            <w:tcW w:type="dxa" w:w="1728"/>
+          </w:tcPr>
+          <w:p>
+            <w:r>
+              <w:t>dtp_1</w:t>
+            </w:r>
+          </w:p>
+        </w:tc>
+        <w:tc>
+          <w:tcPr>
+            <w:tcW w:type="dxa" w:w="1728"/>
+          </w:tcPr>
+          <w:p>
+            <w:r>
+              <w:t>Days-to-payment history</w:t>
+            </w:r>
+          </w:p>
+        </w:tc>
+        <w:tc>
+          <w:tcPr>
+            <w:tcW w:type="dxa" w:w="1728"/>
+          </w:tcPr>
+          <w:p>
+            <w:r>
+              <w:t>Numeric</w:t>
+            </w:r>
+          </w:p>
+        </w:tc>
+        <w:tc>
+          <w:tcPr>
+            <w:tcW w:type="dxa" w:w="1728"/>
+          </w:tcPr>
+          <w:p>
+            <w:r>
+              <w:t>Days to full payment, most recent prior invoice</w:t>
+            </w:r>
+          </w:p>
+        </w:tc>
+        <w:tc>
+          <w:tcPr>
+            <w:tcW w:type="dxa" w:w="1728"/>
+          </w:tcPr>
+          <w:p>
+            <w:r>
+              <w:t>Derived</w:t>
+            </w:r>
+          </w:p>
+        </w:tc>
+      </w:tr>
+      <w:tr>
+        <w:tc>
+          <w:tcPr>
+            <w:tcW w:type="dxa" w:w="1728"/>
+          </w:tcPr>
+          <w:p>
+            <w:r>
+              <w:t>dtp_2</w:t>
+            </w:r>
+          </w:p>
+        </w:tc>
+        <w:tc>
+          <w:tcPr>
+            <w:tcW w:type="dxa" w:w="1728"/>
+          </w:tcPr>
+          <w:p>
+            <w:r>
+              <w:t>Days-to-payment history</w:t>
+            </w:r>
+          </w:p>
+        </w:tc>
+        <w:tc>
+          <w:tcPr>
+            <w:tcW w:type="dxa" w:w="1728"/>
+          </w:tcPr>
+          <w:p>
+            <w:r>
+              <w:t>Numeric</w:t>
+            </w:r>
+          </w:p>
+        </w:tc>
+        <w:tc>
+          <w:tcPr>
+            <w:tcW w:type="dxa" w:w="1728"/>
+          </w:tcPr>
+          <w:p>
+            <w:r>
+              <w:t>Days to full payment, 2nd most recent prior invoice</w:t>
+            </w:r>
+          </w:p>
+        </w:tc>
+        <w:tc>
+          <w:tcPr>
+            <w:tcW w:type="dxa" w:w="1728"/>
+          </w:tcPr>
+          <w:p>
+            <w:r>
+              <w:t>Derived</w:t>
+            </w:r>
+          </w:p>
+        </w:tc>
+      </w:tr>
+      <w:tr>
+        <w:tc>
+          <w:tcPr>
+            <w:tcW w:type="dxa" w:w="1728"/>
+          </w:tcPr>
+          <w:p>
+            <w:r>
+              <w:t>dtp_3</w:t>
+            </w:r>
+          </w:p>
+        </w:tc>
+        <w:tc>
+          <w:tcPr>
+            <w:tcW w:type="dxa" w:w="1728"/>
+          </w:tcPr>
+          <w:p>
+            <w:r>
+              <w:t>Days-to-payment history</w:t>
+            </w:r>
+          </w:p>
+        </w:tc>
+        <w:tc>
+          <w:tcPr>
+            <w:tcW w:type="dxa" w:w="1728"/>
+          </w:tcPr>
+          <w:p>
+            <w:r>
+              <w:t>Numeric</w:t>
+            </w:r>
+          </w:p>
+        </w:tc>
+        <w:tc>
+          <w:tcPr>
+            <w:tcW w:type="dxa" w:w="1728"/>
+          </w:tcPr>
+          <w:p>
+            <w:r>
+              <w:t>Days to full payment, 3rd most recent prior invoice</w:t>
+            </w:r>
+          </w:p>
+        </w:tc>
+        <w:tc>
+          <w:tcPr>
+            <w:tcW w:type="dxa" w:w="1728"/>
+          </w:tcPr>
+          <w:p>
+            <w:r>
+              <w:t>Derived</w:t>
+            </w:r>
+          </w:p>
+        </w:tc>
+      </w:tr>
+      <w:tr>
+        <w:tc>
+          <w:tcPr>
+            <w:tcW w:type="dxa" w:w="1728"/>
+          </w:tcPr>
+          <w:p>
+            <w:r>
+              <w:t>dtp_4</w:t>
+            </w:r>
+          </w:p>
+        </w:tc>
+        <w:tc>
+          <w:tcPr>
+            <w:tcW w:type="dxa" w:w="1728"/>
+          </w:tcPr>
+          <w:p>
+            <w:r>
+              <w:t>Days-to-payment history</w:t>
+            </w:r>
+          </w:p>
+        </w:tc>
+        <w:tc>
+          <w:tcPr>
+            <w:tcW w:type="dxa" w:w="1728"/>
+          </w:tcPr>
+          <w:p>
+            <w:r>
+              <w:t>Numeric</w:t>
+            </w:r>
+          </w:p>
+        </w:tc>
+        <w:tc>
+          <w:tcPr>
+            <w:tcW w:type="dxa" w:w="1728"/>
+          </w:tcPr>
+          <w:p>
+            <w:r>
+              <w:t>Days to full payment, 4th most recent prior invoice</w:t>
+            </w:r>
+          </w:p>
+        </w:tc>
+        <w:tc>
+          <w:tcPr>
+            <w:tcW w:type="dxa" w:w="1728"/>
+          </w:tcPr>
+          <w:p>
+            <w:r>
+              <w:t>Derived</w:t>
+            </w:r>
+          </w:p>
+        </w:tc>
+      </w:tr>
+      <w:tr>
+        <w:tc>
+          <w:tcPr>
+            <w:tcW w:type="dxa" w:w="1728"/>
+          </w:tcPr>
+          <w:p>
+            <w:r>
+              <w:t>dtp_avg</w:t>
+            </w:r>
+          </w:p>
+        </w:tc>
+        <w:tc>
+          <w:tcPr>
+            <w:tcW w:type="dxa" w:w="1728"/>
+          </w:tcPr>
+          <w:p>
+            <w:r>
+              <w:t>Days-to-payment history</w:t>
+            </w:r>
+          </w:p>
+        </w:tc>
+        <w:tc>
+          <w:tcPr>
+            <w:tcW w:type="dxa" w:w="1728"/>
+          </w:tcPr>
+          <w:p>
+            <w:r>
+              <w:t>Numeric</w:t>
+            </w:r>
+          </w:p>
+        </w:tc>
+        <w:tc>
+          <w:tcPr>
+            <w:tcW w:type="dxa" w:w="1728"/>
+          </w:tcPr>
+          <w:p>
+            <w:r>
+              <w:t>Simple average of available DTP values</w:t>
+            </w:r>
+          </w:p>
+        </w:tc>
+        <w:tc>
+          <w:tcPr>
+            <w:tcW w:type="dxa" w:w="1728"/>
+          </w:tcPr>
+          <w:p>
+            <w:r>
+              <w:t>Derived</w:t>
+            </w:r>
+          </w:p>
+        </w:tc>
+      </w:tr>
+      <w:tr>
+        <w:tc>
+          <w:tcPr>
+            <w:tcW w:type="dxa" w:w="1728"/>
+          </w:tcPr>
+          <w:p>
+            <w:r>
+              <w:t>dtp_wavg</w:t>
+            </w:r>
+          </w:p>
+        </w:tc>
+        <w:tc>
+          <w:tcPr>
+            <w:tcW w:type="dxa" w:w="1728"/>
+          </w:tcPr>
+          <w:p>
+            <w:r>
+              <w:t>Days-to-payment history</w:t>
+            </w:r>
+          </w:p>
+        </w:tc>
+        <w:tc>
+          <w:tcPr>
+            <w:tcW w:type="dxa" w:w="1728"/>
+          </w:tcPr>
+          <w:p>
+            <w:r>
+              <w:t>Numeric</w:t>
+            </w:r>
+          </w:p>
+        </w:tc>
+        <w:tc>
+          <w:tcPr>
+            <w:tcW w:type="dxa" w:w="1728"/>
+          </w:tcPr>
+          <w:p>
+            <w:r>
+              <w:t>Weighted average of DTP values (recent invoices weighted higher)</w:t>
+            </w:r>
+          </w:p>
+        </w:tc>
+        <w:tc>
+          <w:tcPr>
+            <w:tcW w:type="dxa" w:w="1728"/>
+          </w:tcPr>
+          <w:p>
+            <w:r>
+              <w:t>Derived</w:t>
+            </w:r>
+          </w:p>
+        </w:tc>
+      </w:tr>
+      <w:tr>
+        <w:tc>
+          <w:tcPr>
+            <w:tcW w:type="dxa" w:w="1728"/>
+          </w:tcPr>
+          <w:p>
+            <w:r>
+              <w:t>dtp_2_trend</w:t>
+            </w:r>
+          </w:p>
+        </w:tc>
+        <w:tc>
+          <w:tcPr>
+            <w:tcW w:type="dxa" w:w="1728"/>
+          </w:tcPr>
+          <w:p>
+            <w:r>
+              <w:t>Days-to-payment history</w:t>
+            </w:r>
+          </w:p>
+        </w:tc>
+        <w:tc>
+          <w:tcPr>
+            <w:tcW w:type="dxa" w:w="1728"/>
+          </w:tcPr>
+          <w:p>
+            <w:r>
+              <w:t>Numeric</w:t>
+            </w:r>
+          </w:p>
+        </w:tc>
+        <w:tc>
+          <w:tcPr>
+            <w:tcW w:type="dxa" w:w="1728"/>
+          </w:tcPr>
+          <w:p>
+            <w:r>
+              <w:t>Slope of DTP across the 2 most recent invoices</w:t>
+            </w:r>
+          </w:p>
+        </w:tc>
+        <w:tc>
+          <w:tcPr>
+            <w:tcW w:type="dxa" w:w="1728"/>
+          </w:tcPr>
+          <w:p>
+            <w:r>
+              <w:t>Derived</w:t>
+            </w:r>
+          </w:p>
+        </w:tc>
+      </w:tr>
+      <w:tr>
+        <w:tc>
+          <w:tcPr>
+            <w:tcW w:type="dxa" w:w="1728"/>
+          </w:tcPr>
+          <w:p>
+            <w:r>
+              <w:t>dtp_3_trend</w:t>
+            </w:r>
+          </w:p>
+        </w:tc>
+        <w:tc>
+          <w:tcPr>
+            <w:tcW w:type="dxa" w:w="1728"/>
+          </w:tcPr>
+          <w:p>
+            <w:r>
+              <w:t>Days-to-payment history</w:t>
+            </w:r>
+          </w:p>
+        </w:tc>
+        <w:tc>
+          <w:tcPr>
+            <w:tcW w:type="dxa" w:w="1728"/>
+          </w:tcPr>
+          <w:p>
+            <w:r>
+              <w:t>Numeric</w:t>
+            </w:r>
+          </w:p>
+        </w:tc>
+        <w:tc>
+          <w:tcPr>
+            <w:tcW w:type="dxa" w:w="1728"/>
+          </w:tcPr>
+          <w:p>
+            <w:r>
+              <w:t>Slope of DTP across the 3 most recent invoices</w:t>
+            </w:r>
+          </w:p>
+        </w:tc>
+        <w:tc>
+          <w:tcPr>
+            <w:tcW w:type="dxa" w:w="1728"/>
+          </w:tcPr>
+          <w:p>
+            <w:r>
+              <w:t>Derived</w:t>
+            </w:r>
+          </w:p>
+        </w:tc>
+      </w:tr>
+      <w:tr>
+        <w:tc>
+          <w:tcPr>
+            <w:tcW w:type="dxa" w:w="1728"/>
+          </w:tcPr>
+          <w:p>
+            <w:r>
+              <w:t>days_since_last_payment</w:t>
+            </w:r>
+          </w:p>
+        </w:tc>
+        <w:tc>
+          <w:tcPr>
+            <w:tcW w:type="dxa" w:w="1728"/>
+          </w:tcPr>
+          <w:p>
+            <w:r>
+              <w:t>Days-to-payment history</w:t>
+            </w:r>
+          </w:p>
+        </w:tc>
+        <w:tc>
+          <w:tcPr>
+            <w:tcW w:type="dxa" w:w="1728"/>
+          </w:tcPr>
+          <w:p>
+            <w:r>
+              <w:t>Numeric</w:t>
+            </w:r>
+          </w:p>
+        </w:tc>
+        <w:tc>
+          <w:tcPr>
+            <w:tcW w:type="dxa" w:w="1728"/>
+          </w:tcPr>
+          <w:p>
+            <w:r>
+              <w:t>Calendar days since the student's last full payment</w:t>
+            </w:r>
+          </w:p>
+        </w:tc>
+        <w:tc>
+          <w:tcPr>
+            <w:tcW w:type="dxa" w:w="1728"/>
+          </w:tcPr>
+          <w:p>
+            <w:r>
+              <w:t>Derived</w:t>
+            </w:r>
+          </w:p>
+        </w:tc>
+      </w:tr>
+      <w:tr>
+        <w:tc>
+          <w:tcPr>
+            <w:tcW w:type="dxa" w:w="1728"/>
+          </w:tcPr>
+          <w:p>
+            <w:r>
+              <w:t>dtp_rolling_std</w:t>
+            </w:r>
+          </w:p>
+        </w:tc>
+        <w:tc>
+          <w:tcPr>
+            <w:tcW w:type="dxa" w:w="1728"/>
+          </w:tcPr>
+          <w:p>
+            <w:r>
+              <w:t>Days-to-payment history</w:t>
+            </w:r>
+          </w:p>
+        </w:tc>
+        <w:tc>
+          <w:tcPr>
+            <w:tcW w:type="dxa" w:w="1728"/>
+          </w:tcPr>
+          <w:p>
+            <w:r>
+              <w:t>Numeric</w:t>
+            </w:r>
+          </w:p>
+        </w:tc>
+        <w:tc>
+          <w:tcPr>
+            <w:tcW w:type="dxa" w:w="1728"/>
+          </w:tcPr>
+          <w:p>
+            <w:r>
+              <w:t>Rolling standard deviation of recent DTP values</w:t>
+            </w:r>
+          </w:p>
+        </w:tc>
+        <w:tc>
+          <w:tcPr>
+            <w:tcW w:type="dxa" w:w="1728"/>
+          </w:tcPr>
+          <w:p>
+            <w:r>
+              <w:t>Derived</w:t>
+            </w:r>
+          </w:p>
+        </w:tc>
+      </w:tr>
+      <w:tr>
+        <w:tc>
+          <w:tcPr>
+            <w:tcW w:type="dxa" w:w="1728"/>
+          </w:tcPr>
+          <w:p>
+            <w:r>
+              <w:t>dtp_max</w:t>
+            </w:r>
+          </w:p>
+        </w:tc>
+        <w:tc>
+          <w:tcPr>
+            <w:tcW w:type="dxa" w:w="1728"/>
+          </w:tcPr>
+          <w:p>
+            <w:r>
+              <w:t>Days-to-payment history</w:t>
+            </w:r>
+          </w:p>
+        </w:tc>
+        <w:tc>
+          <w:tcPr>
+            <w:tcW w:type="dxa" w:w="1728"/>
+          </w:tcPr>
+          <w:p>
+            <w:r>
+              <w:t>Numeric</w:t>
+            </w:r>
+          </w:p>
+        </w:tc>
+        <w:tc>
+          <w:tcPr>
+            <w:tcW w:type="dxa" w:w="1728"/>
+          </w:tcPr>
+          <w:p>
+            <w:r>
+              <w:t>Maximum DTP observed across recent invoices</w:t>
+            </w:r>
+          </w:p>
+        </w:tc>
+        <w:tc>
+          <w:tcPr>
+            <w:tcW w:type="dxa" w:w="1728"/>
+          </w:tcPr>
+          <w:p>
+            <w:r>
+              <w:t>Derived</w:t>
+            </w:r>
+          </w:p>
+        </w:tc>
+      </w:tr>
+      <w:tr>
+        <w:tc>
+          <w:tcPr>
+            <w:tcW w:type="dxa" w:w="1728"/>
+          </w:tcPr>
+          <w:p>
+            <w:r>
+              <w:t>amount_due_cumsum</w:t>
+            </w:r>
+          </w:p>
+        </w:tc>
+        <w:tc>
+          <w:tcPr>
+            <w:tcW w:type="dxa" w:w="1728"/>
+          </w:tcPr>
+          <w:p>
+            <w:r>
+              <w:t>Financial / cumulative</w:t>
+            </w:r>
+          </w:p>
+        </w:tc>
+        <w:tc>
+          <w:tcPr>
+            <w:tcW w:type="dxa" w:w="1728"/>
+          </w:tcPr>
+          <w:p>
+            <w:r>
+              <w:t>Numeric</w:t>
+            </w:r>
+          </w:p>
+        </w:tc>
+        <w:tc>
+          <w:tcPr>
+            <w:tcW w:type="dxa" w:w="1728"/>
+          </w:tcPr>
+          <w:p>
+            <w:r>
+              <w:t>Cumulative total billed to the student to date</w:t>
+            </w:r>
+          </w:p>
+        </w:tc>
+        <w:tc>
+          <w:tcPr>
+            <w:tcW w:type="dxa" w:w="1728"/>
+          </w:tcPr>
+          <w:p>
+            <w:r>
+              <w:t>Derived</w:t>
+            </w:r>
+          </w:p>
+        </w:tc>
+      </w:tr>
+      <w:tr>
+        <w:tc>
+          <w:tcPr>
+            <w:tcW w:type="dxa" w:w="1728"/>
+          </w:tcPr>
+          <w:p>
+            <w:r>
+              <w:t>amount_paid_cumsum</w:t>
+            </w:r>
+          </w:p>
+        </w:tc>
+        <w:tc>
+          <w:tcPr>
+            <w:tcW w:type="dxa" w:w="1728"/>
+          </w:tcPr>
+          <w:p>
+            <w:r>
+              <w:t>Financial / cumulative</w:t>
+            </w:r>
+          </w:p>
+        </w:tc>
+        <w:tc>
+          <w:tcPr>
+            <w:tcW w:type="dxa" w:w="1728"/>
+          </w:tcPr>
+          <w:p>
+            <w:r>
+              <w:t>Numeric</w:t>
+            </w:r>
+          </w:p>
+        </w:tc>
+        <w:tc>
+          <w:tcPr>
+            <w:tcW w:type="dxa" w:w="1728"/>
+          </w:tcPr>
+          <w:p>
+            <w:r>
+              <w:t>Cumulative total paid by the student to date</w:t>
+            </w:r>
+          </w:p>
+        </w:tc>
+        <w:tc>
+          <w:tcPr>
+            <w:tcW w:type="dxa" w:w="1728"/>
+          </w:tcPr>
+          <w:p>
+            <w:r>
+              <w:t>Derived</w:t>
+            </w:r>
+          </w:p>
+        </w:tc>
+      </w:tr>
+      <w:tr>
+        <w:tc>
+          <w:tcPr>
+            <w:tcW w:type="dxa" w:w="1728"/>
+          </w:tcPr>
+          <w:p>
+            <w:r>
+              <w:t>opening_balance</w:t>
+            </w:r>
+          </w:p>
+        </w:tc>
+        <w:tc>
+          <w:tcPr>
+            <w:tcW w:type="dxa" w:w="1728"/>
+          </w:tcPr>
+          <w:p>
+            <w:r>
+              <w:t>Financial / cumulative</w:t>
+            </w:r>
+          </w:p>
+        </w:tc>
+        <w:tc>
+          <w:tcPr>
+            <w:tcW w:type="dxa" w:w="1728"/>
+          </w:tcPr>
+          <w:p>
+            <w:r>
+              <w:t>Numeric</w:t>
+            </w:r>
+          </w:p>
+        </w:tc>
+        <w:tc>
+          <w:tcPr>
+            <w:tcW w:type="dxa" w:w="1728"/>
+          </w:tcPr>
+          <w:p>
+            <w:r>
+              <w:t>Unpaid balance carried over from prior periods</w:t>
+            </w:r>
+          </w:p>
+        </w:tc>
+        <w:tc>
+          <w:tcPr>
+            <w:tcW w:type="dxa" w:w="1728"/>
+          </w:tcPr>
+          <w:p>
+            <w:r>
+              <w:t>Derived</w:t>
+            </w:r>
+          </w:p>
+        </w:tc>
+      </w:tr>
+      <w:tr>
+        <w:tc>
+          <w:tcPr>
+            <w:tcW w:type="dxa" w:w="1728"/>
+          </w:tcPr>
+          <w:p>
+            <w:r>
+              <w:t>opening_balance_flag</w:t>
+            </w:r>
+          </w:p>
+        </w:tc>
+        <w:tc>
+          <w:tcPr>
+            <w:tcW w:type="dxa" w:w="1728"/>
+          </w:tcPr>
+          <w:p>
+            <w:r>
+              <w:t>Financial / cumulative</w:t>
+            </w:r>
+          </w:p>
+        </w:tc>
+        <w:tc>
+          <w:tcPr>
+            <w:tcW w:type="dxa" w:w="1728"/>
+          </w:tcPr>
+          <w:p>
+            <w:r>
+              <w:t>Binary</w:t>
+            </w:r>
+          </w:p>
+        </w:tc>
+        <w:tc>
+          <w:tcPr>
+            <w:tcW w:type="dxa" w:w="1728"/>
+          </w:tcPr>
+          <w:p>
+            <w:r>
+              <w:t>1 if the student has a non-zero opening balance</w:t>
+            </w:r>
+          </w:p>
+        </w:tc>
+        <w:tc>
+          <w:tcPr>
+            <w:tcW w:type="dxa" w:w="1728"/>
+          </w:tcPr>
+          <w:p>
+            <w:r>
+              <w:t>Derived</w:t>
+            </w:r>
+          </w:p>
+        </w:tc>
+      </w:tr>
+      <w:tr>
+        <w:tc>
+          <w:tcPr>
+            <w:tcW w:type="dxa" w:w="1728"/>
+          </w:tcPr>
+          <w:p>
+            <w:r>
+              <w:t>payment_ratio</w:t>
+            </w:r>
+          </w:p>
+        </w:tc>
+        <w:tc>
+          <w:tcPr>
+            <w:tcW w:type="dxa" w:w="1728"/>
+          </w:tcPr>
+          <w:p>
+            <w:r>
+              <w:t>Financial / cumulative</w:t>
+            </w:r>
+          </w:p>
+        </w:tc>
+        <w:tc>
+          <w:tcPr>
+            <w:tcW w:type="dxa" w:w="1728"/>
+          </w:tcPr>
+          <w:p>
+            <w:r>
+              <w:t>Numeric</w:t>
+            </w:r>
+          </w:p>
+        </w:tc>
+        <w:tc>
+          <w:tcPr>
+            <w:tcW w:type="dxa" w:w="1728"/>
+          </w:tcPr>
+          <w:p>
+            <w:r>
+              <w:t>Ratio of cumulative paid to cumulative billed</w:t>
+            </w:r>
+          </w:p>
+        </w:tc>
+        <w:tc>
+          <w:tcPr>
+            <w:tcW w:type="dxa" w:w="1728"/>
+          </w:tcPr>
+          <w:p>
+            <w:r>
+              <w:t>Derived</w:t>
+            </w:r>
+          </w:p>
+        </w:tc>
+      </w:tr>
+      <w:tr>
+        <w:tc>
+          <w:tcPr>
+            <w:tcW w:type="dxa" w:w="1728"/>
+          </w:tcPr>
+          <w:p>
+            <w:r>
+              <w:t>prev_bracket</w:t>
+            </w:r>
+          </w:p>
+        </w:tc>
+        <w:tc>
+          <w:tcPr>
+            <w:tcW w:type="dxa" w:w="1728"/>
+          </w:tcPr>
+          <w:p>
+            <w:r>
+              <w:t>Behavioral / historical</w:t>
+            </w:r>
+          </w:p>
+        </w:tc>
+        <w:tc>
+          <w:tcPr>
+            <w:tcW w:type="dxa" w:w="1728"/>
+          </w:tcPr>
+          <w:p>
+            <w:r>
+              <w:t>Ordinal</w:t>
+            </w:r>
+          </w:p>
+        </w:tc>
+        <w:tc>
+          <w:tcPr>
+            <w:tcW w:type="dxa" w:w="1728"/>
+          </w:tcPr>
+          <w:p>
+            <w:r>
+              <w:t>Payment bracket of the most recent prior invoice</w:t>
+            </w:r>
+          </w:p>
+        </w:tc>
+        <w:tc>
+          <w:tcPr>
+            <w:tcW w:type="dxa" w:w="1728"/>
+          </w:tcPr>
+          <w:p>
+            <w:r>
+              <w:t>Derived</w:t>
+            </w:r>
+          </w:p>
+        </w:tc>
+      </w:tr>
+      <w:tr>
+        <w:tc>
+          <w:tcPr>
+            <w:tcW w:type="dxa" w:w="1728"/>
+          </w:tcPr>
+          <w:p>
+            <w:r>
+              <w:t>early_payer_flag</w:t>
+            </w:r>
+          </w:p>
+        </w:tc>
+        <w:tc>
+          <w:tcPr>
+            <w:tcW w:type="dxa" w:w="1728"/>
+          </w:tcPr>
+          <w:p>
+            <w:r>
+              <w:t>Behavioral / historical</w:t>
+            </w:r>
+          </w:p>
+        </w:tc>
+        <w:tc>
+          <w:tcPr>
+            <w:tcW w:type="dxa" w:w="1728"/>
+          </w:tcPr>
+          <w:p>
+            <w:r>
+              <w:t>Binary</w:t>
+            </w:r>
+          </w:p>
+        </w:tc>
+        <w:tc>
+          <w:tcPr>
+            <w:tcW w:type="dxa" w:w="1728"/>
+          </w:tcPr>
+          <w:p>
+            <w:r>
+              <w:t>1 if the student has a history of paying before the due date</w:t>
+            </w:r>
+          </w:p>
+        </w:tc>
+        <w:tc>
+          <w:tcPr>
+            <w:tcW w:type="dxa" w:w="1728"/>
+          </w:tcPr>
+          <w:p>
+            <w:r>
+              <w:t>Derived</w:t>
+            </w:r>
+          </w:p>
+        </w:tc>
+      </w:tr>
+      <w:tr>
+        <w:tc>
+          <w:tcPr>
+            <w:tcW w:type="dxa" w:w="1728"/>
+          </w:tcPr>
+          <w:p>
+            <w:r>
+              <w:t>on_time_streak</w:t>
+            </w:r>
+          </w:p>
+        </w:tc>
+        <w:tc>
+          <w:tcPr>
+            <w:tcW w:type="dxa" w:w="1728"/>
+          </w:tcPr>
+          <w:p>
+            <w:r>
+              <w:t>Behavioral / historical</w:t>
+            </w:r>
+          </w:p>
+        </w:tc>
+        <w:tc>
+          <w:tcPr>
+            <w:tcW w:type="dxa" w:w="1728"/>
+          </w:tcPr>
+          <w:p>
+            <w:r>
+              <w:t>Integer</w:t>
+            </w:r>
+          </w:p>
+        </w:tc>
+        <w:tc>
+          <w:tcPr>
+            <w:tcW w:type="dxa" w:w="1728"/>
+          </w:tcPr>
+          <w:p>
+            <w:r>
+              <w:t>Consecutive on-time payments preceding the current invoice</w:t>
+            </w:r>
+          </w:p>
+        </w:tc>
+        <w:tc>
+          <w:tcPr>
+            <w:tcW w:type="dxa" w:w="1728"/>
+          </w:tcPr>
+          <w:p>
+            <w:r>
+              <w:t>Derived</w:t>
+            </w:r>
+          </w:p>
+        </w:tc>
+      </w:tr>
+      <w:tr>
+        <w:tc>
+          <w:tcPr>
+            <w:tcW w:type="dxa" w:w="1728"/>
+          </w:tcPr>
+          <w:p>
+            <w:r>
+              <w:t>plan_type_Plan - A</w:t>
+            </w:r>
+          </w:p>
+        </w:tc>
+        <w:tc>
+          <w:tcPr>
+            <w:tcW w:type="dxa" w:w="1728"/>
+          </w:tcPr>
+          <w:p>
+            <w:r>
+              <w:t>Payment plan</w:t>
+            </w:r>
+          </w:p>
+        </w:tc>
+        <w:tc>
+          <w:tcPr>
+            <w:tcW w:type="dxa" w:w="1728"/>
+          </w:tcPr>
+          <w:p>
+            <w:r>
+              <w:t>Binary (one-hot)</w:t>
+            </w:r>
+          </w:p>
+        </w:tc>
+        <w:tc>
+          <w:tcPr>
+            <w:tcW w:type="dxa" w:w="1728"/>
+          </w:tcPr>
+          <w:p>
+            <w:r>
+              <w:t>Full payment upfront</w:t>
+            </w:r>
+          </w:p>
+        </w:tc>
+        <w:tc>
+          <w:tcPr>
+            <w:tcW w:type="dxa" w:w="1728"/>
+          </w:tcPr>
+          <w:p>
+            <w:r>
+              <w:t>Enrollees</w:t>
+            </w:r>
+          </w:p>
+        </w:tc>
+      </w:tr>
+      <w:tr>
+        <w:tc>
+          <w:tcPr>
+            <w:tcW w:type="dxa" w:w="1728"/>
+          </w:tcPr>
+          <w:p>
+            <w:r>
+              <w:t>plan_type_Plan - B</w:t>
+            </w:r>
+          </w:p>
+        </w:tc>
+        <w:tc>
+          <w:tcPr>
+            <w:tcW w:type="dxa" w:w="1728"/>
+          </w:tcPr>
+          <w:p>
+            <w:r>
+              <w:t>Payment plan</w:t>
+            </w:r>
+          </w:p>
+        </w:tc>
+        <w:tc>
+          <w:tcPr>
+            <w:tcW w:type="dxa" w:w="1728"/>
+          </w:tcPr>
+          <w:p>
+            <w:r>
+              <w:t>Binary (one-hot)</w:t>
+            </w:r>
+          </w:p>
+        </w:tc>
+        <w:tc>
+          <w:tcPr>
+            <w:tcW w:type="dxa" w:w="1728"/>
+          </w:tcPr>
+          <w:p>
+            <w:r>
+              <w:t>Installment plan with up to 3 payments (1–30 days)</w:t>
+            </w:r>
+          </w:p>
+        </w:tc>
+        <w:tc>
+          <w:tcPr>
+            <w:tcW w:type="dxa" w:w="1728"/>
+          </w:tcPr>
+          <w:p>
+            <w:r>
+              <w:t>Enrollees</w:t>
+            </w:r>
+          </w:p>
+        </w:tc>
+      </w:tr>
+      <w:tr>
+        <w:tc>
+          <w:tcPr>
+            <w:tcW w:type="dxa" w:w="1728"/>
+          </w:tcPr>
+          <w:p>
+            <w:r>
+              <w:t>plan_type_Plan - C</w:t>
+            </w:r>
+          </w:p>
+        </w:tc>
+        <w:tc>
+          <w:tcPr>
+            <w:tcW w:type="dxa" w:w="1728"/>
+          </w:tcPr>
+          <w:p>
+            <w:r>
+              <w:t>Payment plan</w:t>
+            </w:r>
+          </w:p>
+        </w:tc>
+        <w:tc>
+          <w:tcPr>
+            <w:tcW w:type="dxa" w:w="1728"/>
+          </w:tcPr>
+          <w:p>
+            <w:r>
+              <w:t>Binary (one-hot)</w:t>
+            </w:r>
+          </w:p>
+        </w:tc>
+        <w:tc>
+          <w:tcPr>
+            <w:tcW w:type="dxa" w:w="1728"/>
+          </w:tcPr>
+          <w:p>
+            <w:r>
+              <w:t>Installment plan with up to 6 payments (31–60 days)</w:t>
+            </w:r>
+          </w:p>
+        </w:tc>
+        <w:tc>
+          <w:tcPr>
+            <w:tcW w:type="dxa" w:w="1728"/>
+          </w:tcPr>
+          <w:p>
+            <w:r>
+              <w:t>Enrollees</w:t>
+            </w:r>
+          </w:p>
+        </w:tc>
+      </w:tr>
+      <w:tr>
+        <w:tc>
+          <w:tcPr>
+            <w:tcW w:type="dxa" w:w="1728"/>
+          </w:tcPr>
+          <w:p>
+            <w:r>
+              <w:t>plan_type_Plan - D</w:t>
+            </w:r>
+          </w:p>
+        </w:tc>
+        <w:tc>
+          <w:tcPr>
+            <w:tcW w:type="dxa" w:w="1728"/>
+          </w:tcPr>
+          <w:p>
+            <w:r>
+              <w:t>Payment plan</w:t>
+            </w:r>
+          </w:p>
+        </w:tc>
+        <w:tc>
+          <w:tcPr>
+            <w:tcW w:type="dxa" w:w="1728"/>
+          </w:tcPr>
+          <w:p>
+            <w:r>
+              <w:t>Binary (one-hot)</w:t>
+            </w:r>
+          </w:p>
+        </w:tc>
+        <w:tc>
+          <w:tcPr>
+            <w:tcW w:type="dxa" w:w="1728"/>
+          </w:tcPr>
+          <w:p>
+            <w:r>
+              <w:t>Monthly installment plan (61+ days)</w:t>
+            </w:r>
+          </w:p>
+        </w:tc>
+        <w:tc>
+          <w:tcPr>
+            <w:tcW w:type="dxa" w:w="1728"/>
+          </w:tcPr>
+          <w:p>
+            <w:r>
+              <w:t>Enrollees</w:t>
+            </w:r>
+          </w:p>
+        </w:tc>
+      </w:tr>
+      <w:tr>
+        <w:tc>
+          <w:tcPr>
+            <w:tcW w:type="dxa" w:w="1728"/>
+          </w:tcPr>
+          <w:p>
+            <w:r>
+              <w:t>plan_type_Plan - E</w:t>
+            </w:r>
+          </w:p>
+        </w:tc>
+        <w:tc>
+          <w:tcPr>
+            <w:tcW w:type="dxa" w:w="1728"/>
+          </w:tcPr>
+          <w:p>
+            <w:r>
+              <w:t>Payment plan</w:t>
+            </w:r>
+          </w:p>
+        </w:tc>
+        <w:tc>
+          <w:tcPr>
+            <w:tcW w:type="dxa" w:w="1728"/>
+          </w:tcPr>
+          <w:p>
+            <w:r>
+              <w:t>Binary (one-hot)</w:t>
+            </w:r>
+          </w:p>
+        </w:tc>
+        <w:tc>
+          <w:tcPr>
+            <w:tcW w:type="dxa" w:w="1728"/>
+          </w:tcPr>
+          <w:p>
+            <w:r>
+              <w:t>Special COVID-era plan (one school year only)</w:t>
+            </w:r>
+          </w:p>
+        </w:tc>
+        <w:tc>
+          <w:tcPr>
+            <w:tcW w:type="dxa" w:w="1728"/>
+          </w:tcPr>
+          <w:p>
+            <w:r>
+              <w:t>Enrollees</w:t>
+            </w:r>
+          </w:p>
+        </w:tc>
+      </w:tr>
+      <w:tr>
+        <w:tc>
+          <w:tcPr>
+            <w:tcW w:type="dxa" w:w="1728"/>
+          </w:tcPr>
+          <w:p>
+            <w:r>
+              <w:t>plan_type_nan</w:t>
+            </w:r>
+          </w:p>
+        </w:tc>
+        <w:tc>
+          <w:tcPr>
+            <w:tcW w:type="dxa" w:w="1728"/>
+          </w:tcPr>
+          <w:p>
+            <w:r>
+              <w:t>Payment plan</w:t>
+            </w:r>
+          </w:p>
+        </w:tc>
+        <w:tc>
+          <w:tcPr>
+            <w:tcW w:type="dxa" w:w="1728"/>
+          </w:tcPr>
+          <w:p>
+            <w:r>
+              <w:t>Binary (one-hot)</w:t>
+            </w:r>
+          </w:p>
+        </w:tc>
+        <w:tc>
+          <w:tcPr>
+            <w:tcW w:type="dxa" w:w="1728"/>
+          </w:tcPr>
+          <w:p>
+            <w:r>
+              <w:t>No plan assigned; student not enrolled</w:t>
+            </w:r>
+          </w:p>
+        </w:tc>
+        <w:tc>
+          <w:tcPr>
+            <w:tcW w:type="dxa" w:w="1728"/>
+          </w:tcPr>
+          <w:p>
+            <w:r>
+              <w:t>Enrollees</w:t>
+            </w:r>
+          </w:p>
+        </w:tc>
+      </w:tr>
+      <w:tr>
+        <w:tc>
+          <w:tcPr>
+            <w:tcW w:type="dxa" w:w="1728"/>
+          </w:tcPr>
+          <w:p>
+            <w:r>
+              <w:t>plan_type_risk_score</w:t>
+            </w:r>
+          </w:p>
+        </w:tc>
+        <w:tc>
+          <w:tcPr>
+            <w:tcW w:type="dxa" w:w="1728"/>
+          </w:tcPr>
+          <w:p>
+            <w:r>
+              <w:t>Payment plan</w:t>
+            </w:r>
+          </w:p>
+        </w:tc>
+        <w:tc>
+          <w:tcPr>
+            <w:tcW w:type="dxa" w:w="1728"/>
+          </w:tcPr>
+          <w:p>
+            <w:r>
+              <w:t>Ordinal</w:t>
+            </w:r>
+          </w:p>
+        </w:tc>
+        <w:tc>
+          <w:tcPr>
+            <w:tcW w:type="dxa" w:w="1728"/>
+          </w:tcPr>
+          <w:p>
+            <w:r>
+              <w:t>Plan type encoded by associated payment risk (A=0 … none=5)</w:t>
+            </w:r>
+          </w:p>
+        </w:tc>
+        <w:tc>
+          <w:tcPr>
+            <w:tcW w:type="dxa" w:w="1728"/>
+          </w:tcPr>
+          <w:p>
+            <w:r>
+              <w:t>Derived</w:t>
+            </w:r>
+          </w:p>
+        </w:tc>
+      </w:tr>
+      <w:tr>
+        <w:tc>
+          <w:tcPr>
+            <w:tcW w:type="dxa" w:w="1728"/>
+          </w:tcPr>
+          <w:p>
+            <w:r>
+              <w:t>due_month</w:t>
+            </w:r>
+          </w:p>
+        </w:tc>
+        <w:tc>
+          <w:tcPr>
+            <w:tcW w:type="dxa" w:w="1728"/>
+          </w:tcPr>
+          <w:p>
+            <w:r>
+              <w:t>Temporal</w:t>
+            </w:r>
+          </w:p>
+        </w:tc>
+        <w:tc>
+          <w:tcPr>
+            <w:tcW w:type="dxa" w:w="1728"/>
+          </w:tcPr>
+          <w:p>
+            <w:r>
+              <w:t>Integer (1–12)</w:t>
+            </w:r>
+          </w:p>
+        </w:tc>
+        <w:tc>
+          <w:tcPr>
+            <w:tcW w:type="dxa" w:w="1728"/>
+          </w:tcPr>
+          <w:p>
+            <w:r>
+              <w:t>Calendar month of the due date</w:t>
+            </w:r>
+          </w:p>
+        </w:tc>
+        <w:tc>
+          <w:tcPr>
+            <w:tcW w:type="dxa" w:w="1728"/>
+          </w:tcPr>
+          <w:p>
+            <w:r>
+              <w:t>Derived</w:t>
+            </w:r>
+          </w:p>
+        </w:tc>
+      </w:tr>
+      <w:tr>
+        <w:tc>
+          <w:tcPr>
+            <w:tcW w:type="dxa" w:w="1728"/>
+          </w:tcPr>
+          <w:p>
+            <w:r>
+              <w:t>due_quarter</w:t>
+            </w:r>
+          </w:p>
+        </w:tc>
+        <w:tc>
+          <w:tcPr>
+            <w:tcW w:type="dxa" w:w="1728"/>
+          </w:tcPr>
+          <w:p>
+            <w:r>
+              <w:t>Temporal</w:t>
+            </w:r>
+          </w:p>
+        </w:tc>
+        <w:tc>
+          <w:tcPr>
+            <w:tcW w:type="dxa" w:w="1728"/>
+          </w:tcPr>
+          <w:p>
+            <w:r>
+              <w:t>Integer (1–4)</w:t>
+            </w:r>
+          </w:p>
+        </w:tc>
+        <w:tc>
+          <w:tcPr>
+            <w:tcW w:type="dxa" w:w="1728"/>
+          </w:tcPr>
+          <w:p>
+            <w:r>
+              <w:t>Fiscal quarter of the due date</w:t>
+            </w:r>
+          </w:p>
+        </w:tc>
+        <w:tc>
+          <w:tcPr>
+            <w:tcW w:type="dxa" w:w="1728"/>
+          </w:tcPr>
+          <w:p>
+            <w:r>
+              <w:t>Derived</w:t>
+            </w:r>
+          </w:p>
+        </w:tc>
+      </w:tr>
+      <w:tr>
+        <w:tc>
+          <w:tcPr>
+            <w:tcW w:type="dxa" w:w="1728"/>
+          </w:tcPr>
+          <w:p>
+            <w:r>
+              <w:t>partial_hazard</w:t>
+            </w:r>
+          </w:p>
+        </w:tc>
+        <w:tc>
+          <w:tcPr>
+            <w:tcW w:type="dxa" w:w="1728"/>
+          </w:tcPr>
+          <w:p>
+            <w:r>
+              <w:t>Survival analysis</w:t>
+            </w:r>
+          </w:p>
+        </w:tc>
+        <w:tc>
+          <w:tcPr>
+            <w:tcW w:type="dxa" w:w="1728"/>
+          </w:tcPr>
+          <w:p>
+            <w:r>
+              <w:t>Numeric</w:t>
+            </w:r>
+          </w:p>
+        </w:tc>
+        <w:tc>
+          <w:tcPr>
+            <w:tcW w:type="dxa" w:w="1728"/>
+          </w:tcPr>
+          <w:p>
+            <w:r>
+              <w:t>Exponentiated linear predictor from the Cox PH model</w:t>
+            </w:r>
+          </w:p>
+        </w:tc>
+        <w:tc>
+          <w:tcPr>
+            <w:tcW w:type="dxa" w:w="1728"/>
+          </w:tcPr>
+          <w:p>
+            <w:r>
+              <w:t>Cox PH model</w:t>
+            </w:r>
+          </w:p>
+        </w:tc>
+      </w:tr>
+      <w:tr>
+        <w:tc>
+          <w:tcPr>
+            <w:tcW w:type="dxa" w:w="1728"/>
+          </w:tcPr>
+          <w:p>
+            <w:r>
+              <w:t>log_partial_hazard</w:t>
+            </w:r>
+          </w:p>
+        </w:tc>
+        <w:tc>
+          <w:tcPr>
+            <w:tcW w:type="dxa" w:w="1728"/>
+          </w:tcPr>
+          <w:p>
+            <w:r>
+              <w:t>Survival analysis</w:t>
+            </w:r>
+          </w:p>
+        </w:tc>
+        <w:tc>
+          <w:tcPr>
+            <w:tcW w:type="dxa" w:w="1728"/>
+          </w:tcPr>
+          <w:p>
+            <w:r>
+              <w:t>Numeric</w:t>
+            </w:r>
+          </w:p>
+        </w:tc>
+        <w:tc>
+          <w:tcPr>
+            <w:tcW w:type="dxa" w:w="1728"/>
+          </w:tcPr>
+          <w:p>
+            <w:r>
+              <w:t>Natural log of the partial hazard</w:t>
+            </w:r>
+          </w:p>
+        </w:tc>
+        <w:tc>
+          <w:tcPr>
+            <w:tcW w:type="dxa" w:w="1728"/>
+          </w:tcPr>
+          <w:p>
+            <w:r>
+              <w:t>Cox PH model</w:t>
+            </w:r>
+          </w:p>
+        </w:tc>
+      </w:tr>
+      <w:tr>
+        <w:tc>
+          <w:tcPr>
+            <w:tcW w:type="dxa" w:w="1728"/>
+          </w:tcPr>
+          <w:p>
+            <w:r>
+              <w:t>expected_survival_time</w:t>
+            </w:r>
+          </w:p>
+        </w:tc>
+        <w:tc>
+          <w:tcPr>
+            <w:tcW w:type="dxa" w:w="1728"/>
+          </w:tcPr>
+          <w:p>
+            <w:r>
+              <w:t>Survival analysis</w:t>
+            </w:r>
+          </w:p>
+        </w:tc>
+        <w:tc>
+          <w:tcPr>
+            <w:tcW w:type="dxa" w:w="1728"/>
+          </w:tcPr>
+          <w:p>
+            <w:r>
+              <w:t>Numeric</w:t>
+            </w:r>
+          </w:p>
+        </w:tc>
+        <w:tc>
+          <w:tcPr>
+            <w:tcW w:type="dxa" w:w="1728"/>
+          </w:tcPr>
+          <w:p>
+            <w:r>
+              <w:t>Expected days to full payment under the Cox model</w:t>
+            </w:r>
+          </w:p>
+        </w:tc>
+        <w:tc>
+          <w:tcPr>
+            <w:tcW w:type="dxa" w:w="1728"/>
+          </w:tcPr>
+          <w:p>
+            <w:r>
+              <w:t>Cox PH model</w:t>
+            </w:r>
+          </w:p>
+        </w:tc>
+      </w:tr>
+      <w:tr>
+        <w:tc>
+          <w:tcPr>
+            <w:tcW w:type="dxa" w:w="1728"/>
+          </w:tcPr>
+          <w:p>
+            <w:r>
+              <w:t>survival_probability</w:t>
+            </w:r>
+          </w:p>
+        </w:tc>
+        <w:tc>
+          <w:tcPr>
+            <w:tcW w:type="dxa" w:w="1728"/>
+          </w:tcPr>
+          <w:p>
+            <w:r>
+              <w:t>Survival analysis</w:t>
+            </w:r>
+          </w:p>
+        </w:tc>
+        <w:tc>
+          <w:tcPr>
+            <w:tcW w:type="dxa" w:w="1728"/>
+          </w:tcPr>
+          <w:p>
+            <w:r>
+              <w:t>Numeric</w:t>
+            </w:r>
+          </w:p>
+        </w:tc>
+        <w:tc>
+          <w:tcPr>
+            <w:tcW w:type="dxa" w:w="1728"/>
+          </w:tcPr>
+          <w:p>
+            <w:r>
+              <w:t>Probability of remaining unpaid beyond a reference time point</w:t>
+            </w:r>
+          </w:p>
+        </w:tc>
+        <w:tc>
+          <w:tcPr>
+            <w:tcW w:type="dxa" w:w="1728"/>
+          </w:tcPr>
+          <w:p>
+            <w:r>
+              <w:t>Cox PH model</w:t>
+            </w:r>
+          </w:p>
+        </w:tc>
+      </w:tr>
+      <w:tr>
+        <w:tc>
+          <w:tcPr>
+            <w:tcW w:type="dxa" w:w="1728"/>
+          </w:tcPr>
+          <w:p>
+            <w:r>
+              <w:t>cumulative_hazard</w:t>
+            </w:r>
+          </w:p>
+        </w:tc>
+        <w:tc>
+          <w:tcPr>
+            <w:tcW w:type="dxa" w:w="1728"/>
+          </w:tcPr>
+          <w:p>
+            <w:r>
+              <w:t>Survival analysis</w:t>
+            </w:r>
+          </w:p>
+        </w:tc>
+        <w:tc>
+          <w:tcPr>
+            <w:tcW w:type="dxa" w:w="1728"/>
+          </w:tcPr>
+          <w:p>
+            <w:r>
+              <w:t>Numeric</w:t>
+            </w:r>
+          </w:p>
+        </w:tc>
+        <w:tc>
+          <w:tcPr>
+            <w:tcW w:type="dxa" w:w="1728"/>
+          </w:tcPr>
+          <w:p>
+            <w:r>
+              <w:t>Cumulative hazard at the reference time point</w:t>
+            </w:r>
+          </w:p>
+        </w:tc>
+        <w:tc>
+          <w:tcPr>
+            <w:tcW w:type="dxa" w:w="1728"/>
+          </w:tcPr>
+          <w:p>
+            <w:r>
+              <w:t>Cox PH model</w:t>
+            </w:r>
+          </w:p>
+        </w:tc>
+      </w:tr>
+      <w:tr>
+        <w:tc>
+          <w:tcPr>
+            <w:tcW w:type="dxa" w:w="1728"/>
+          </w:tcPr>
+          <w:p>
+            <w:r>
+              <w:t>dtp_bracket</w:t>
+            </w:r>
+          </w:p>
+        </w:tc>
+        <w:tc>
+          <w:tcPr>
+            <w:tcW w:type="dxa" w:w="1728"/>
+          </w:tcPr>
+          <w:p>
+            <w:r>
+              <w:t>Target variable</w:t>
+            </w:r>
+          </w:p>
+        </w:tc>
+        <w:tc>
+          <w:tcPr>
+            <w:tcW w:type="dxa" w:w="1728"/>
+          </w:tcPr>
+          <w:p>
+            <w:r>
+              <w:t>Ordinal (4 classes)</w:t>
+            </w:r>
+          </w:p>
+        </w:tc>
+        <w:tc>
+          <w:tcPr>
+            <w:tcW w:type="dxa" w:w="1728"/>
+          </w:tcPr>
+          <w:p>
+            <w:r>
+              <w:t>Payment bracket label: on-time, 1–30, 31–60, or 61+ days late</w:t>
+            </w:r>
+          </w:p>
+        </w:tc>
+        <w:tc>
+          <w:tcPr>
+            <w:tcW w:type="dxa" w:w="1728"/>
+          </w:tcPr>
+          <w:p>
+            <w:r>
+              <w:t>Derived</w:t>
+            </w:r>
+          </w:p>
+        </w:tc>
+      </w:tr>
+      <w:tr>
+        <w:tc>
+          <w:tcPr>
+            <w:tcW w:type="dxa" w:w="1728"/>
+          </w:tcPr>
+          <w:p>
+            <w:r>
+              <w:t>censor</w:t>
+            </w:r>
+          </w:p>
+        </w:tc>
+        <w:tc>
+          <w:tcPr>
+            <w:tcW w:type="dxa" w:w="1728"/>
+          </w:tcPr>
+          <w:p>
+            <w:r>
+              <w:t>Target variable</w:t>
+            </w:r>
+          </w:p>
+        </w:tc>
+        <w:tc>
+          <w:tcPr>
+            <w:tcW w:type="dxa" w:w="1728"/>
+          </w:tcPr>
+          <w:p>
+            <w:r>
+              <w:t>Binary</w:t>
+            </w:r>
+          </w:p>
+        </w:tc>
+        <w:tc>
+          <w:tcPr>
+            <w:tcW w:type="dxa" w:w="1728"/>
+          </w:tcPr>
+          <w:p>
+            <w:r>
+              <w:t>1 if the invoice was still unpaid at the observation cutoff</w:t>
+            </w:r>
+          </w:p>
+        </w:tc>
+        <w:tc>
+          <w:tcPr>
+            <w:tcW w:type="dxa" w:w="1728"/>
+          </w:tcPr>
+          <w:p>
+            <w:r>
+              <w:t>Derived</w:t>
+            </w:r>
+          </w:p>
+        </w:tc>
+      </w:tr>
+    </w:tbl>
+    <w:p>
+      <w:pPr>
+        <w:pStyle w:val="ThesisParagraphText"/>
+      </w:pPr>
+      <w:r>
+        <w:t>The raw data files underlying these variables are not publicly available due to the privacy constraints described in Section 3.7.1; access may be requested through institutional channels, subject to the authorization conditions documented in Appendix G.</w:t>
       </w:r>
     </w:p>
     <w:p>

</xml_diff>

<commit_message>
docs(refs): fix informal entries, add missing references, renumber by first mention
Tasks 7.1-7.3 of THESIS_REVISION_PLAN.md:
- Replace [41] Awe (incomplete), [42] MachineLearningMastery, and
  [43] GeeksforGeeks with proper academic sources: Chawla et al. 2002
  (SMOTE), Han et al. 2005 (Borderline-SMOTE), Batista et al. 2004
  (SMOTE+Tomek)
- Add He & Garcia 2009 (imbalanced learning), Cox 1972 (proportional
  hazards), RA 10173 (Data Privacy Act of 2012), and United Nations 2015
  (SDG framework); all are cited in the revised text
- Renumber all 47 references in order of first mention, rewriting every
  in-text [n] citation (body paragraphs and table cells) and reordering
  the reference list to match; citation groups re-sorted ascending

Co-Authored-By: Claude Fable 5 <noreply@anthropic.com>
</commit_message>
<xml_diff>
--- a/Beley-Reyes_Thesis2-ACM.docx
+++ b/Beley-Reyes_Thesis2-ACM.docx
@@ -5164,7 +5164,7 @@
         <w:pStyle w:val="ThesisParagraphText"/>
       </w:pPr>
       <w:r>
-        <w:t>A substantial body of machine learning research has addressed the IPPP and adjacent receivables-prediction problems, employing models such as Logistic Regression, Random Forest, XGBoost, LightGBM, and neural networks. Schoonbee, Moore, and van Vuuren [8] applied a machine-learning decision-support approach to invoice payment prediction in an educational setting and reported classification accuracies of approximately 80–85% using tree-based ensembles, while Moore and van Vuuren [4] combined survival analysis with machine learning in their Modelling Invoice Payment Predictions (MIPP) framework to forecast the settlement timing of customer invoices. In the educational domain, Mugorobin et al. [3] developed an estimation system for late payment of school tuition fees, and Martikainen [5] demonstrated that statistical learning methods such as logistic regression can predict late payment of sales invoices with actionable discrimination. At the customer level, Cheong [29] and Appel et al. [28] showed that ensemble models trained on transaction histories can reduce unnecessary collection interventions, and Abbas and Hussein [12] confirmed that modern boosting algorithms such as XGBoost and LightGBM significantly outperform conventional statistical baselines in loan default prediction.</w:t>
+        <w:t>A substantial body of machine learning research has addressed the IPPP and adjacent receivables-prediction problems, employing models such as Logistic Regression, Random Forest, XGBoost, LightGBM, and neural networks. Schoonbee, Moore, and van Vuuren [5] applied a machine-learning decision-support approach to invoice payment prediction in an educational setting and reported classification accuracies of approximately 80–85% using tree-based ensembles, while Moore and van Vuuren [4] combined survival analysis with machine learning in their Modelling Invoice Payment Predictions (MIPP) framework to forecast the settlement timing of customer invoices. In the educational domain, Mugorobin et al. [3] developed an estimation system for late payment of school tuition fees, and Martikainen [6] demonstrated that statistical learning methods such as logistic regression can predict late payment of sales invoices with actionable discrimination. At the customer level, Cheong [7] and Appel et al. [8] showed that ensemble models trained on transaction histories can reduce unnecessary collection interventions, and Abbas and Hussein [9] confirmed that modern boosting algorithms such as XGBoost and LightGBM significantly outperform conventional statistical baselines in loan default prediction.</w:t>
       </w:r>
     </w:p>
     <w:p>
@@ -5331,7 +5331,7 @@
           </w:tcPr>
           <w:p>
             <w:r>
-              <w:t>Schoonbee et al. (2021) [8]</w:t>
+              <w:t>Schoonbee et al. (2021) [5]</w:t>
             </w:r>
           </w:p>
         </w:tc>
@@ -5435,7 +5435,7 @@
           </w:tcPr>
           <w:p>
             <w:r>
-              <w:t>Martikainen (2023) [5]</w:t>
+              <w:t>Martikainen (2023) [6]</w:t>
             </w:r>
           </w:p>
         </w:tc>
@@ -5487,7 +5487,7 @@
           </w:tcPr>
           <w:p>
             <w:r>
-              <w:t>Cheong (2022) [29]</w:t>
+              <w:t>Cheong (2022) [7]</w:t>
             </w:r>
           </w:p>
         </w:tc>
@@ -5558,13 +5558,11 @@
         <w:pStyle w:val="ThesisParagraphText"/>
       </w:pPr>
       <w:r>
-        <w:t>Existing IPPP research has largely focused on corporate trade credit and retail contexts [4</w:t>
-      </w:r>
-      <w:r>
-        <w:t xml:space="preserve">, 5, </w:t>
-      </w:r>
-      <w:r>
-        <w:t xml:space="preserve">6], where the primary signal is aggregate invoice history, customer size, and industry classification. Educational institutions present a structurally distinct setting that has received comparatively little attention. In the Philippine private school sector, invoicing is shaped by installment plan selection (annual, semi-annual, quarterly, monthly), category-level subcategory charges (tuition, miscellaneous fees, course materials), and strong regulatory constraints that prevent service denial. Notably, the No Permit, No Exam Prohibition Act (Republic Act 11984) [7] bars schools from withholding examination privileges due to outstanding tuition, while DepEd and CHED memoranda further restrict collection enforcement. Schools must therefore continue instructional delivery regardless </w:t>
+        <w:t>Existing IPPP research has largely focused on corporate trade credit and retail contexts [4, 6, 10]</w:t>
+      </w:r>
+      <w:r/>
+      <w:r>
+        <w:t xml:space="preserve">, where the primary signal is aggregate invoice history, customer size, and industry classification. Educational institutions present a structurally distinct setting that has received comparatively little attention. In the Philippine private school sector, invoicing is shaped by installment plan selection (annual, semi-annual, quarterly, monthly), category-level subcategory charges (tuition, miscellaneous fees, course materials), and strong regulatory constraints that prevent service denial. Notably, the No Permit, No Exam Prohibition Act (Republic Act 11984) [11] bars schools from withholding examination privileges due to outstanding tuition, while DepEd and CHED memoranda further restrict collection enforcement. Schools must therefore continue instructional delivery regardless </w:t>
       </w:r>
       <w:r>
         <w:lastRenderedPageBreak/>
@@ -5616,7 +5614,7 @@
         <w:ind w:firstLine="360"/>
       </w:pPr>
       <w:r>
-        <w:t>A proactive, predictive framework is operationally necessary. Prior work on IPPP in educational contexts has used broad student-level features without disaggregating by product or service category [3, 4, 8]. At the same time, methodological gaps persist in the general IPPP literature: existing benchmarks compare a small number of standard classifiers (typically 5–8 models) and rarely evaluate approaches that exploit the ordinal structure of payment-delay targets. Payment delay is inherently ordered</w:t>
+        <w:t>A proactive, predictive framework is operationally necessary. Prior work on IPPP in educational contexts has used broad student-level features without disaggregating by product or service category [3, 4, 5]. At the same time, methodological gaps persist in the general IPPP literature: existing benchmarks compare a small number of standard classifiers (typically 5–8 models) and rarely evaluate approaches that exploit the ordinal structure of payment-delay targets. Payment delay is inherently ordered</w:t>
       </w:r>
       <w:r>
         <w:t xml:space="preserve">: </w:t>
@@ -5634,7 +5632,7 @@
         <w:t>Y</w:t>
       </w:r>
       <w:r>
-        <w:t>et most classifiers treat it as a nominal multi-class problem, discarding the ranking information embedded in the label ordering. Ordinal classifiers [9] and two-stage ensemble architectures have demonstrated improvements in other ordered multi-class problems but have not been systematically evaluated in the IPPP context. Furthermore, the integration of survival-analysis techniques to model time-to-payment has not been benchmarked against standard resampling methods in this domain.</w:t>
+        <w:t>et most classifiers treat it as a nominal multi-class problem, discarding the ranking information embedded in the label ordering. Ordinal classifiers [12] and two-stage ensemble architectures have demonstrated improvements in other ordered multi-class problems but have not been systematically evaluated in the IPPP context. Furthermore, the integration of survival-analysis techniques to model time-to-payment has not been benchmarked against standard resampling methods in this domain.</w:t>
       </w:r>
     </w:p>
     <w:p>
@@ -5802,7 +5800,7 @@
         <w:pStyle w:val="ThesisParagraphText"/>
       </w:pPr>
       <w:r>
-        <w:t>This study offers direct operational value to the partner institution. The bad-debt and collection trends documented in Table 2.1 — bad debts expense rising from PHP 248,650 in school year 2019 to PHP 352,075 in 2025, with Days Sales Outstanding persisting between 36 and 49 days in recent years — indicate that reactive collection practices have not contained receivable risk. By predicting the payment bracket of every invoice at issuance, the system enables finance officers to anticipate cash shortfalls, to target reminders and restructuring offers before due dates lapse, and to reduce bad-debt exposure by shifting from reactive to proactive cash flow management. Beyond the partner school, the framework is transferable to Philippine private schools broadly: such institutions share substantially similar installment-billing structures and operate under the same enforcement constraints imposed by Republic Act 11984 [7], so any school capable of exporting standard revenue and enrollment records can retrain the pipeline on its own data without architectural modification.</w:t>
+        <w:t>This study offers direct operational value to the partner institution. The bad-debt and collection trends documented in Table 2.1 — bad debts expense rising from PHP 248,650 in school year 2019 to PHP 352,075 in 2025, with Days Sales Outstanding persisting between 36 and 49 days in recent years — indicate that reactive collection practices have not contained receivable risk. By predicting the payment bracket of every invoice at issuance, the system enables finance officers to anticipate cash shortfalls, to target reminders and restructuring offers before due dates lapse, and to reduce bad-debt exposure by shifting from reactive to proactive cash flow management. Beyond the partner school, the framework is transferable to Philippine private schools broadly: such institutions share substantially similar installment-billing structures and operate under the same enforcement constraints imposed by Republic Act 11984 [11], so any school capable of exporting standard revenue and enrollment records can retrain the pipeline on its own data without architectural modification.</w:t>
       </w:r>
     </w:p>
     <w:p>
@@ -5810,7 +5808,7 @@
         <w:pStyle w:val="ThesisParagraphText"/>
       </w:pPr>
       <w:r>
-        <w:t>For the academic community, this is the first study to benchmark ordinal classifiers and two-stage ensemble architectures specifically for the educational Invoice Payment Prediction Problem, directly addressing the methodological gaps identified in Schoonbee et al. [8] and Moore and van Vuuren [4]. For data science practice more generally, the study demonstrates that survival-analysis feature engineering has conditional rather than universal utility: Cox-derived hazard features improve distance-based and probabilistic learners while adding redundant or noisy signal to high-capacity tree ensembles. This finding carries implications beyond the IPPP, suggesting that feature engineering effort should be allocated according to the inductive capacity of the downstream learner rather than applied uniformly across model families.</w:t>
+        <w:t>For the academic community, this is the first study to benchmark ordinal classifiers and two-stage ensemble architectures specifically for the educational Invoice Payment Prediction Problem, directly addressing the methodological gaps identified in Schoonbee et al. [5] and Moore and van Vuuren [4]. For data science practice more generally, the study demonstrates that survival-analysis feature engineering has conditional rather than universal utility: Cox-derived hazard features improve distance-based and probabilistic learners while adding redundant or noisy signal to high-capacity tree ensembles. This finding carries implications beyond the IPPP, suggesting that feature engineering effort should be allocated according to the inductive capacity of the downstream learner rather than applied uniformly across model families.</w:t>
       </w:r>
     </w:p>
     <w:p>
@@ -5826,7 +5824,7 @@
         <w:pStyle w:val="ThesisParagraphText"/>
       </w:pPr>
       <w:r>
-        <w:t>This research contributes to several of the United Nations Sustainable Development Goals (SDGs) articulated in the 2030 Agenda for Sustainable Development [47]. With respect to SDG 4 (Quality Education), the prediction system protects an institution's capacity to deliver quality education by helping it maintain financial sustainability: schools facing cash flow crises may be forced to cut staff, reduce learning resources, or close programs, so proactive receivables management directly protects educational continuity. With respect to SDG 8 (Decent Work and Economic Growth), predictive accounts-receivable management reduces financial uncertainty for small and medium-sized private educational institutions, supporting their role as employers and contributors to local economic activity.</w:t>
+        <w:t>This research contributes to several of the United Nations Sustainable Development Goals (SDGs) articulated in the 2030 Agenda for Sustainable Development [13]. With respect to SDG 4 (Quality Education), the prediction system protects an institution's capacity to deliver quality education by helping it maintain financial sustainability: schools facing cash flow crises may be forced to cut staff, reduce learning resources, or close programs, so proactive receivables management directly protects educational continuity. With respect to SDG 8 (Decent Work and Economic Growth), predictive accounts-receivable management reduces financial uncertainty for small and medium-sized private educational institutions, supporting their role as employers and contributors to local economic activity.</w:t>
       </w:r>
     </w:p>
     <w:p>
@@ -5834,7 +5832,7 @@
         <w:pStyle w:val="ThesisParagraphText"/>
       </w:pPr>
       <w:r>
-        <w:t>The study likewise advances SDG 10 (Reduced Inequalities), because the model enables schools to identify at-risk families earlier and to offer targeted payment assistance — installment restructuring or referral for social welfare certification — rather than punitive enforcement, consistent with the equity-oriented intent of Republic Act 11984 [7]. With respect to SDG 16 (Peace, Justice, and Strong Institutions), the use of pseudonymized data, compliance with the Data Privacy Act of 2012, and a transparent, fully logged machine learning methodology demonstrate responsible institutional governance and data stewardship. Finally, in support of SDG 17 (Partnerships for the Goals), the open benchmarking framework and the accompanying web prototype are designed to be replicable by other institutions, supporting knowledge sharing and institutional capacity building across the sector.</w:t>
+        <w:t>The study likewise advances SDG 10 (Reduced Inequalities), because the model enables schools to identify at-risk families earlier and to offer targeted payment assistance — installment restructuring or referral for social welfare certification — rather than punitive enforcement, consistent with the equity-oriented intent of Republic Act 11984 [11]. With respect to SDG 16 (Peace, Justice, and Strong Institutions), the use of pseudonymized data, compliance with the Data Privacy Act of 2012, and a transparent, fully logged machine learning methodology demonstrate responsible institutional governance and data stewardship. Finally, in support of SDG 17 (Partnerships for the Goals), the open benchmarking framework and the accompanying web prototype are designed to be replicable by other institutions, supporting knowledge sharing and institutional capacity building across the sector.</w:t>
       </w:r>
     </w:p>
     <w:p>
@@ -5956,7 +5954,7 @@
         <w:pStyle w:val="ThesisParagraphText"/>
       </w:pPr>
       <w:r>
-        <w:t xml:space="preserve">On the corporate finance side, companies often use smart, data-backed methods to manage their receivables. Peng and Tian [10] created an intelligent optimization model that showcases how predictive analytics can lessen financial pressure by foreseeing potential late payments. Similarly, Ramkumar and Karthick [11] found that machine learning techniques significantly outperform traditional methods in predicting how and when payments will be made. More recent studies, such as Abbas and Hussein [12], confirm that ML models like XGBoost and </w:t>
+        <w:t xml:space="preserve">On the corporate finance side, companies often use smart, data-backed methods to manage their receivables. Peng and Tian [14] created an intelligent optimization model that showcases how predictive analytics can lessen financial pressure by foreseeing potential late payments. Similarly, Ramkumar and Karthick [15] found that machine learning techniques significantly outperform traditional methods in predicting how and when payments will be made. More recent studies, such as Abbas and Hussein [9], confirm that ML models like XGBoost and </w:t>
       </w:r>
       <w:proofErr w:type="spellStart"/>
       <w:r>
@@ -5976,7 +5974,7 @@
         <w:pStyle w:val="ThesisParagraphText"/>
       </w:pPr>
       <w:r>
-        <w:t>This challenge has become more pronounced in the Philippine context with the enactment of the No Permit, No Exam Prohibition Act (RA 11984) [7], which bars schools from denying students access to examinations due to unpaid tuition. While the law promotes educational equity, it also removes one of the primary reinforcement mechanisms schools previously relied on to ensure timely payments. Respicio and Co. Law [13] warned that this shift may lead to higher accounts receivable balances, delayed cash inflows, and increased risk of bad debts unless schools adopt proactive financial management strategies. The implementing guidelines further introduce administrative step</w:t>
+        <w:t>This challenge has become more pronounced in the Philippine context with the enactment of the No Permit, No Exam Prohibition Act (RA 11984) [11], which bars schools from denying students access to examinations due to unpaid tuition. While the law promotes educational equity, it also removes one of the primary reinforcement mechanisms schools previously relied on to ensure timely payments. Respicio and Co. Law [16] warned that this shift may lead to higher accounts receivable balances, delayed cash inflows, and increased risk of bad debts unless schools adopt proactive financial management strategies. The implementing guidelines further introduce administrative step</w:t>
       </w:r>
       <w:r>
         <w:t>s.</w:t>
@@ -6035,7 +6033,7 @@
         <w:pStyle w:val="ThesisParagraphText"/>
       </w:pPr>
       <w:r>
-        <w:t>In South Africa, Mestry [14] emphasized that non-payment or partial payment of school fees disrupts budget execution and undermines institutional goals, while Naicker [15] found that fluctuating fee payments complicate financial planning and threaten sustainability. The Education Policy and Data Center [16] similarly documented implementation gaps in fee collection policies, where unclear guidelines led to inconsistent and delayed payments. MRI Software TPN [17] also noted that unpaid fees force reductions in staff and infrastructure investment. Broader reports by the Associated Press [18] and the World Bank [19] confirm that unpredictable school-fee systems across Sub-Saharan Africa have caused both increased arrears and higher dropout rates, further destabilizing education systems.</w:t>
+        <w:t>In South Africa, Mestry [17] emphasized that non-payment or partial payment of school fees disrupts budget execution and undermines institutional goals, while Naicker [18] found that fluctuating fee payments complicate financial planning and threaten sustainability. The Education Policy and Data Center [19] similarly documented implementation gaps in fee collection policies, where unclear guidelines led to inconsistent and delayed payments. MRI Software TPN [20] also noted that unpaid fees force reductions in staff and infrastructure investment. Broader reports by the Associated Press [21] and the World Bank [22] confirm that unpredictable school-fee systems across Sub-Saharan Africa have caused both increased arrears and higher dropout rates, further destabilizing education systems.</w:t>
       </w:r>
     </w:p>
     <w:p>
@@ -6043,7 +6041,7 @@
         <w:pStyle w:val="ThesisParagraphText"/>
       </w:pPr>
       <w:r>
-        <w:t>In Asia, similar patterns emerge. Thuy et al. [20] compared machine learning and deep learning models in student credit scoring in Vietnam, highlighting the growing need for predictive approaches to manage tuition-related risks. Their findings suggest that data-driven models can help schools anticipate defaults and design targeted interventions. In the Philippines, Carvajal et al. [21] revealed that low levels of financial literacy contribute to poor debt management among students, while Mencias-Tabernilla [22] documented how teachers themselves often struggle with debt, indirectly affecting household capacity to meet tuition obligations.</w:t>
+        <w:t>In Asia, similar patterns emerge. Thuy et al. [23] compared machine learning and deep learning models in student credit scoring in Vietnam, highlighting the growing need for predictive approaches to manage tuition-related risks. Their findings suggest that data-driven models can help schools anticipate defaults and design targeted interventions. In the Philippines, Carvajal et al. [24] revealed that low levels of financial literacy contribute to poor debt management among students, while Mencias-Tabernilla [25] documented how teachers themselves often struggle with debt, indirectly affecting household capacity to meet tuition obligations.</w:t>
       </w:r>
     </w:p>
     <w:p>
@@ -7499,8 +7497,7 @@
         <w:t xml:space="preserve">These patterns reveal that, despite offering flexible payment options, schools remain at risk when families fail to pay on time. The upward trend in bad debt expense lowers an institution's liquidity, challenging its ability to fund operations, invest in resources, and maintain educational quality. In contrast with other businesses that can vet clients for creditworthiness, Philippine educational institutions operate under laws that emphasize accessibility. The 1987 Philippine Constitution (Art. XIV, Sec. 1-2) and various DepEd </w:t>
       </w:r>
       <w:r>
-        <w:lastRenderedPageBreak/>
-        <w:t>Orders make clear that schools cannot turn families away based on financial situation. Recent legislation, RA 11984, further ensures that students cannot be barred from exams over unpaid tuition [7, 13, 23]. While these regulations promote fairness, they amplify the financial challenges faced by private schools, making receivable predictions all the more critical.</w:t>
+        <w:t>Orders make clear that schools cannot turn families away based on financial situation. Recent legislation, RA 11984, further ensures that students cannot be barred from exams over unpaid tuition [11, 16, 26]. While these regulations promote fairness, they amplify the financial challenges faced by private schools, making receivable predictions all the more critical.</w:t>
       </w:r>
     </w:p>
     <w:p>
@@ -7534,7 +7531,7 @@
         <w:pStyle w:val="ThesisParagraphText"/>
       </w:pPr>
       <w:r>
-        <w:t>Foundational research by Breiman (2001) [1] introduced random forests, an ensemble method that has become fundamental in risk assessment and payment prediction tasks. Lessman et al. (2015) [24] benchmarked leading classification algorithms for credit scoring and discovered that ML models, like gradient boosting and random forests, markedly enhance predictive accuracy compared to traditional methods such as logistic regression. Baesens et al. (2003) [25] highlighted the interpretability of neural networks when combined with rule extraction, bridging the gap between predictive power and decision transparency. Recent developments by Xu et al. (2024) [26] demonstrated how deep learning and big data can be leveraged to predict financial risk behaviors, underscoring the growing importance of contextual and behavioral variables in model performance.</w:t>
+        <w:t>Foundational research by Breiman (2001) [1] introduced random forests, an ensemble method that has become fundamental in risk assessment and payment prediction tasks. Lessman et al. (2015) [27] benchmarked leading classification algorithms for credit scoring and discovered that ML models, like gradient boosting and random forests, markedly enhance predictive accuracy compared to traditional methods such as logistic regression. Baesens et al. (2003) [28] highlighted the interpretability of neural networks when combined with rule extraction, bridging the gap between predictive power and decision transparency. Recent developments by Xu et al. (2024) [29] demonstrated how deep learning and big data can be leveraged to predict financial risk behaviors, underscoring the growing importance of contextual and behavioral variables in model performance.</w:t>
       </w:r>
     </w:p>
     <w:p>
@@ -7542,8 +7539,7 @@
         <w:pStyle w:val="ThesisParagraphText"/>
       </w:pPr>
       <w:r>
-        <w:lastRenderedPageBreak/>
-        <w:t>Despite these advances, challenges remain. Feature selection and interpretability continue to be critical issues, especially in institutional contexts where decision-makers require not only accurate predictions but also transparent justifications for interventions. As Tsai, Huang, and Chen (2017) [27] noted in their study on hybrid ML techniques for credit rating, combining multiple algorithms can improve accuracy but often at the cost of interpretability. This tension between predictive performance and explainability is particularly relevant in education finance, where stakeholders must balance technical sophistication with accountability and trust.</w:t>
+        <w:t>Despite these advances, challenges remain. Feature selection and interpretability continue to be critical issues, especially in institutional contexts where decision-makers require not only accurate predictions but also transparent justifications for interventions. As Tsai, Huang, and Chen (2017) [30] noted in their study on hybrid ML techniques for credit rating, combining multiple algorithms can improve accuracy but often at the cost of interpretability. This tension between predictive performance and explainability is particularly relevant in education finance, where stakeholders must balance technical sophistication with accountability and trust.</w:t>
       </w:r>
       <w:r>
         <w:t xml:space="preserve"> While these studies address credit risk in general, the same algorithmic advances form the technical foundation for the more specific task at hand, predicting when individual invoices will be paid, which the next section reviews.</w:t>
@@ -7564,7 +7560,7 @@
         <w:pStyle w:val="ThesisParagraphText"/>
       </w:pPr>
       <w:r>
-        <w:t>A central theme in the invoice payment prediction literature is the continuous effort to refine models through improved variable selection and methodological approaches. Early studies applied ML to accounts receivable and customer-level data, demonstrating the potential of predictive analytics in managing cash flow. Appel et al. [28] developed ML models to predict account receivables, emphasizing the importance of transaction histories and customer segmentation. Cheong [29] introduced customer-level predictive modeling for receivables, showing how individualized features could reduce unnecessary interventions.</w:t>
+        <w:t>A central theme in the invoice payment prediction literature is the continuous effort to refine models through improved variable selection and methodological approaches. Early studies applied ML to accounts receivable and customer-level data, demonstrating the potential of predictive analytics in managing cash flow. Appel et al. [8] developed ML models to predict account receivables, emphasizing the importance of transaction histories and customer segmentation. Cheong [7] introduced customer-level predictive modeling for receivables, showing how individualized features could reduce unnecessary interventions.</w:t>
       </w:r>
     </w:p>
     <w:p>
@@ -7572,7 +7568,7 @@
         <w:pStyle w:val="ThesisParagraphText"/>
       </w:pPr>
       <w:r>
-        <w:t>In the educational context, Moore and van Vuuren [4] proposed the Modelling Invoice Payment Predictions (MIPP) framework, which combined survival analysis with ML to forecast student payment behaviors. Their work demonstrated that historical payment patterns could improve accuracy, though the framework did not incorporate granular product or service categories. Extending this line of inquiry, Schoonbee, Moore, and van Vuuren [8] applied ML to South African educational data, creating a decision-</w:t>
+        <w:t>In the educational context, Moore and van Vuuren [4] proposed the Modelling Invoice Payment Predictions (MIPP) framework, which combined survival analysis with ML to forecast student payment behaviors. Their work demonstrated that historical payment patterns could improve accuracy, though the framework did not incorporate granular product or service categories. Extending this line of inquiry, Schoonbee, Moore, and van Vuuren [5] applied ML to South African educational data, creating a decision-</w:t>
       </w:r>
       <w:r>
         <w:lastRenderedPageBreak/>
@@ -7584,7 +7580,7 @@
         <w:pStyle w:val="ThesisParagraphText"/>
       </w:pPr>
       <w:r>
-        <w:t>Other studies have explored statistical and hybrid approaches. Martikainen [5] applied statistical learning methods to predict late payment of sales invoices, providing evidence that even relatively simple models can yield actionable insights when applied to institutional data. In parallel, Mugorobin et al. [3] developed an estimation system for late tuition payments, underscoring the operational importance of predictive tools in schools. Khedr and Sheeja [6] reviewed ML applications in supply chain management, highlighting the role of digitization and transaction-level granularity in improving payment behavior analysis.</w:t>
+        <w:t>Other studies have explored statistical and hybrid approaches. Martikainen [6] applied statistical learning methods to predict late payment of sales invoices, providing evidence that even relatively simple models can yield actionable insights when applied to institutional data. In parallel, Mugorobin et al. [3] developed an estimation system for late tuition payments, underscoring the operational importance of predictive tools in schools. Khedr and Sheeja [10] reviewed ML applications in supply chain management, highlighting the role of digitization and transaction-level granularity in improving payment behavior analysis.</w:t>
       </w:r>
     </w:p>
     <w:p>
@@ -7610,7 +7606,7 @@
         <w:pStyle w:val="ThesisParagraphText"/>
       </w:pPr>
       <w:r>
-        <w:t xml:space="preserve">While existing invoice prediction models have demonstrated the value of historical payment data, recent research suggests that granularity — the inclusion of fine-grained, transaction-specific variables — can substantially improve predictive accuracy. In retail analytics, Wei et al. [30] introduced the Retail Product Checkout (RPC) dataset, which showed that distinguishing products at a detailed level significantly enhanced model performance. </w:t>
+        <w:t xml:space="preserve">While existing invoice prediction models have demonstrated the value of historical payment data, recent research suggests that granularity — the inclusion of fine-grained, transaction-specific variables — can substantially improve predictive accuracy. In retail analytics, Wei et al. [31] introduced the Retail Product Checkout (RPC) dataset, which showed that distinguishing products at a detailed level significantly enhanced model performance. </w:t>
       </w:r>
     </w:p>
     <w:p>
@@ -7635,7 +7631,7 @@
         <w:t xml:space="preserve"> </w:t>
       </w:r>
       <w:r>
-        <w:t>Demographic and socioeconomic variables: family income, household debt, financial literacy [21, 22].</w:t>
+        <w:t>Demographic and socioeconomic variables: family income, household debt, financial literacy [24, 25].</w:t>
       </w:r>
       <w:r>
         <w:t xml:space="preserve"> </w:t>
@@ -7655,7 +7651,7 @@
         <w:t xml:space="preserve"> </w:t>
       </w:r>
       <w:r>
-        <w:t>Academic and institutional variables: program type, year level, installment plan [7, 14, 15, 16, 17, 20].</w:t>
+        <w:t>Academic and institutional variables: program type, year level, installment plan [11, 17, 18, 19, 20, 23].</w:t>
       </w:r>
       <w:r>
         <w:t xml:space="preserve"> </w:t>
@@ -7668,11 +7664,10 @@
         <w:t>(c)</w:t>
       </w:r>
       <w:r>
-        <w:t xml:space="preserve"> Behavioral and transactional variables: historical arrears, frequency of late payments [3, 7, </w:t>
-      </w:r>
-      <w:r>
-        <w:lastRenderedPageBreak/>
-        <w:t>13].</w:t>
+        <w:t xml:space="preserve"> Behavioral and transactional variables: historical arrears, frequency of late payments [3, 11, 16]</w:t>
+      </w:r>
+      <w:r>
+        <w:t>.</w:t>
       </w:r>
       <w:r>
         <w:t xml:space="preserve"> </w:t>
@@ -7685,7 +7680,7 @@
         <w:t>(d)</w:t>
       </w:r>
       <w:r>
-        <w:t xml:space="preserve"> Policy and contextual variables: RA 11984 compliance, macroeconomic shocks [7, 18, 19, 23].</w:t>
+        <w:t xml:space="preserve"> Policy and contextual variables: RA 11984 compliance, macroeconomic shocks [11, 21, 22, 26].</w:t>
       </w:r>
     </w:p>
     <w:p>
@@ -7703,7 +7698,7 @@
         <w:pStyle w:val="ThesisParagraphText"/>
       </w:pPr>
       <w:r>
-        <w:t>At the macro level, political and economic stressors directly affect household income and, consequently, tuition payment behavior. Voghouei et al. [31] demonstrated that political and economic instability can significantly affect financial development, reducing the capacity of households to meet recurring obligations. Legal and policy frameworks further shape payment dynamics. The 1987 Philippine Constitution (Art. XIV, Sec. 1-2) guarantees the right to education, while DepEd Orders prohibit schools from denying enrollment based on financial incapacity. Together, these factors explain why invoices in private schools often remain unpaid for extended periods, underscoring the need for predictive interventions.</w:t>
+        <w:t>At the macro level, political and economic stressors directly affect household income and, consequently, tuition payment behavior. Voghouei et al. [32] demonstrated that political and economic instability can significantly affect financial development, reducing the capacity of households to meet recurring obligations. Legal and policy frameworks further shape payment dynamics. The 1987 Philippine Constitution (Art. XIV, Sec. 1-2) guarantees the right to education, while DepEd Orders prohibit schools from denying enrollment based on financial incapacity. Together, these factors explain why invoices in private schools often remain unpaid for extended periods, underscoring the need for predictive interventions.</w:t>
       </w:r>
     </w:p>
     <w:p>
@@ -7711,7 +7706,7 @@
         <w:pStyle w:val="ThesisParagraphText"/>
       </w:pPr>
       <w:r>
-        <w:t>Philippine evidence sharpens this picture at the household level. Carvajal et al. [21] surveyed financial literacy and debt management practices and found that low financial literacy is associated with poor debt management, a mechanism that translates directly into erratic tuition payment: families that do not budget for recurring obligations accumulate school balances even when income is nominally sufficient. Mencias-Tabernilla [22] documented the expenditure patterns and debt profiles of Filipino teachers, showing that chronic indebtedness extends even to salaried education professionals; if the households of stable wage earners struggle with recurring debt, tuition-paying families with irregular incomes are plausibly at greater risk. Finally, the implementing context of RA 11984 [7, 13, 23] shapes behavior on both sides of the transaction: students cannot be barred from examinations over unpaid fees, while schools must channel hardship cases through social welfare certification and restructuring procedures. These local realities make payment-timing prediction more valuable in the Philippine setting than in jurisdictions where enforcement remains available.</w:t>
+        <w:t>Philippine evidence sharpens this picture at the household level. Carvajal et al. [24] surveyed financial literacy and debt management practices and found that low financial literacy is associated with poor debt management, a mechanism that translates directly into erratic tuition payment: families that do not budget for recurring obligations accumulate school balances even when income is nominally sufficient. Mencias-Tabernilla [25] documented the expenditure patterns and debt profiles of Filipino teachers, showing that chronic indebtedness extends even to salaried education professionals; if the households of stable wage earners struggle with recurring debt, tuition-paying families with irregular incomes are plausibly at greater risk. Finally, the implementing context of RA 11984 [11, 16, 26] shapes behavior on both sides of the transaction: students cannot be barred from examinations over unpaid fees, while schools must channel hardship cases through social welfare certification and restructuring procedures. These local realities make payment-timing prediction more valuable in the Philippine setting than in jurisdictions where enforcement remains available.</w:t>
       </w:r>
     </w:p>
     <w:p>
@@ -7736,7 +7731,7 @@
     </w:p>
     <w:p>
       <w:r>
-        <w:t>Educational institutions typically employ a layered set of collection mechanisms. The most common first-line instrument is the administrative reminder campaign, ranging from printed statements of account to scheduled text-message and email reminders ahead of due dates, which practitioner literature identifies as the cheapest and most scalable intervention [32, 33]. When reminders fail, schools escalate to formal instruments: promissory notes that document a committed payment date, late-payment fees or surcharge schedules intended to price delinquency, and installment restructuring that converts an overdue lump sum into smaller scheduled payments [33, 34]. Some institutions complement these with incentives such as early-payment discounts or sibling rebates to reward timely settlement [32]. These practices, consistent with the tuition collection literature [32, 33, 34], remain the dominant standard operating procedures in many schools, including the partner institution. Their common weakness is that all of them, except early-payment incentives, are triggered only after an invoice has already become delinquent.</w:t>
+        <w:t>Educational institutions typically employ a layered set of collection mechanisms. The most common first-line instrument is the administrative reminder campaign, ranging from printed statements of account to scheduled text-message and email reminders ahead of due dates, which practitioner literature identifies as the cheapest and most scalable intervention [33, 34]. When reminders fail, schools escalate to formal instruments: promissory notes that document a committed payment date, late-payment fees or surcharge schedules intended to price delinquency, and installment restructuring that converts an overdue lump sum into smaller scheduled payments [34, 35]. Some institutions complement these with incentives such as early-payment discounts or sibling rebates to reward timely settlement [33]. These practices, consistent with the tuition collection literature [33, 34, 35], remain the dominant standard operating procedures in many schools, including the partner institution. Their common weakness is that all of them, except early-payment incentives, are triggered only after an invoice has already become delinquent.</w:t>
       </w:r>
     </w:p>
     <w:p>
@@ -7751,7 +7746,7 @@
     </w:p>
     <w:p>
       <w:r>
-        <w:t>The effectiveness of these strategies is procedurally constrained by RA 11984 [7, 13, 23]. The law categorically prohibits schools from denying examinations to students with outstanding balances, removing the single strongest enforcement mechanism previously available to private institutions [7]. Its implementing guidelines add further procedural requirements: students invoking financial hardship must submit certifications from the Department of Social Welfare and Development (DSWD), and schools are in turn expected to provide installment restructuring or deferred payment arrangements rather than refuse service [13, 23]. Legal commentary has warned that this combination lengthens collection cycles, extends credit exposure, and may raise accounts receivable balances unless schools adopt proactive financial management [13]. As a result, institutions are structurally bound to continue providing instruction even as receivables accumulate, which converts collections from an enforcement problem into a forecasting problem.</w:t>
+        <w:t>The effectiveness of these strategies is procedurally constrained by RA 11984 [11, 16, 26]. The law categorically prohibits schools from denying examinations to students with outstanding balances, removing the single strongest enforcement mechanism previously available to private institutions [11]. Its implementing guidelines add further procedural requirements: students invoking financial hardship must submit certifications from the Department of Social Welfare and Development (DSWD), and schools are in turn expected to provide installment restructuring or deferred payment arrangements rather than refuse service [16, 26]. Legal commentary has warned that this combination lengthens collection cycles, extends credit exposure, and may raise accounts receivable balances unless schools adopt proactive financial management [16]. As a result, institutions are structurally bound to continue providing instruction even as receivables accumulate, which converts collections from an enforcement problem into a forecasting problem.</w:t>
       </w:r>
     </w:p>
     <w:p>
@@ -7766,13 +7761,13 @@
     </w:p>
     <w:p>
       <w:r>
-        <w:t>Given the limitations of traditional strategies, machine learning offers a structurally different alternative: rather than reacting to delinquency after a due date has lapsed, a predictive model assigns every invoice a payment-delay risk estimate at the moment it is issued. Studies in credit scoring and receivables management [6, 24, 29, 35] demonstrate that predictive models trained on granular behavioral features consistently outperform reactive heuristics, because they convert historical payment patterns into forward-looking early-warning signals.</w:t>
+        <w:t>Given the limitations of traditional strategies, machine learning offers a structurally different alternative: rather than reacting to delinquency after a due date has lapsed, a predictive model assigns every invoice a payment-delay risk estimate at the moment it is issued. Studies in credit scoring and receivables management [7, 10, 27, 36] demonstrate that predictive models trained on granular behavioral features consistently outperform reactive heuristics, because they convert historical payment patterns into forward-looking early-warning signals.</w:t>
       </w:r>
     </w:p>
     <w:p>
       <w:pPr/>
       <w:r>
-        <w:t>The operational mechanism is straightforward. An invoice predicted to fall into a late bracket can be routed to a pre-due-date intervention, such as an earlier reminder, a proactive offer of installment restructuring, or a guidance conversation with the family, while invoices predicted to be paid on time require no action at all. This targeting matters under RA 11984: since post-due-date enforcement is legally restricted, the value of knowing which invoices are at risk before they become delinquent is amplified. Cheong [29] showed that customer-level prediction reduces unnecessary intervention actions, and Schoonbee et al. [8] demonstrated decision-support value in an educational context; this study extends that logic to category-level invoices in a Philippine private school.</w:t>
+        <w:t>The operational mechanism is straightforward. An invoice predicted to fall into a late bracket can be routed to a pre-due-date intervention, such as an earlier reminder, a proactive offer of installment restructuring, or a guidance conversation with the family, while invoices predicted to be paid on time require no action at all. This targeting matters under RA 11984: since post-due-date enforcement is legally restricted, the value of knowing which invoices are at risk before they become delinquent is amplified. Cheong [7] showed that customer-level prediction reduces unnecessary intervention actions, and Schoonbee et al. [5] demonstrated decision-support value in an educational context; this study extends that logic to category-level invoices in a Philippine private school.</w:t>
       </w:r>
     </w:p>
     <w:p>
@@ -7790,7 +7785,7 @@
         <w:pStyle w:val="ThesisParagraphText"/>
       </w:pPr>
       <w:r>
-        <w:t>A fundamental property of payment-delay targets is their inherent ordering, from on-time settlement through progressively later payment brackets. Frank and Hall [9] introduced a simple and influential approach to ordinal classification that decomposes a k-class ordinal problem into k-1 binary sub-problems: for the four payment brackets used in this study, three binary classifiers are trained to estimate P(target &gt; on-time), P(target &gt; 1–30 days), and P(target &gt; 31–60 days), and the per-class probabilities are then recovered by differencing the cumulative estimates. Because each binary sub-problem preserves the ordering of the label space, the decomposition allows any probabilistic base classifier to exploit ranking information that a nominal multi-class formulation discards.</w:t>
+        <w:t>A fundamental property of payment-delay targets is their inherent ordering, from on-time settlement through progressively later payment brackets. Frank and Hall [12] introduced a simple and influential approach to ordinal classification that decomposes a k-class ordinal problem into k-1 binary sub-problems: for the four payment brackets used in this study, three binary classifiers are trained to estimate P(target &gt; on-time), P(target &gt; 1–30 days), and P(target &gt; 31–60 days), and the per-class probabilities are then recovered by differencing the cumulative estimates. Because each binary sub-problem preserves the ordering of the label space, the decomposition allows any probabilistic base classifier to exploit ranking information that a nominal multi-class formulation discards.</w:t>
       </w:r>
     </w:p>
     <w:p>
@@ -7798,7 +7793,7 @@
         <w:pStyle w:val="ThesisParagraphText"/>
       </w:pPr>
       <w:r>
-        <w:t>Two-stage architectures approach the same label structure from a different angle: where the Frank–Hall scheme is a decomposed view of one ordinal problem, a two-stage design is hierarchical. A first-stage binary classifier separates on-time from late invoices, directly attacking the dominant source of class imbalance, and a second-stage multi-class model, trained only on delinquent records, determines delay severity. The hierarchy mirrors institutional decision-making (first, will this invoice be late; second, how late) and allows each stage to specialize on a better-balanced sub-problem. Architectures of this kind have proven effective in credit risk [24], medical diagnosis [25], and receivables management [35], but had not previously been benchmarked at scale for the IPPP.</w:t>
+        <w:t>Two-stage architectures approach the same label structure from a different angle: where the Frank–Hall scheme is a decomposed view of one ordinal problem, a two-stage design is hierarchical. A first-stage binary classifier separates on-time from late invoices, directly attacking the dominant source of class imbalance, and a second-stage multi-class model, trained only on delinquent records, determines delay severity. The hierarchy mirrors institutional decision-making (first, will this invoice be late; second, how late) and allows each stage to specialize on a better-balanced sub-problem. Architectures of this kind have proven effective in credit risk [27], medical diagnosis [28], and receivables management [36], but had not previously been benchmarked at scale for the IPPP.</w:t>
       </w:r>
     </w:p>
     <w:p>
@@ -7816,7 +7811,7 @@
         <w:pStyle w:val="ThesisParagraphText"/>
       </w:pPr>
       <w:r>
-        <w:t>Survival analysis provides a statistical framework for modeling the time until an event occurs — here, the time until an invoice is fully paid. Its defining advantage over standard classification is its treatment of censoring: at any observation cutoff, some invoices remain unpaid, and their eventual payment delay is unknown rather than missing. A conventional late/not-late variable must either discard these records or mislabel them, whereas survival methods retain censored invoices and extract partial information from the fact that they have survived unpaid up to the cutoff. The Cox Proportional Hazards model [45] formalizes this by expressing each invoice's hazard rate, the instantaneous probability of payment at time t given non-payment until t, as a baseline hazard scaled by an exponential function of the invoice's covariates. Each invoice therefore receives a continuous risk profile (partial hazard, expected settlement time, survival probability at reference horizons) rather than a single binary flag, a conceptually richer representation of payment timing.</w:t>
+        <w:t>Survival analysis provides a statistical framework for modeling the time until an event occurs — here, the time until an invoice is fully paid. Its defining advantage over standard classification is its treatment of censoring: at any observation cutoff, some invoices remain unpaid, and their eventual payment delay is unknown rather than missing. A conventional late/not-late variable must either discard these records or mislabel them, whereas survival methods retain censored invoices and extract partial information from the fact that they have survived unpaid up to the cutoff. The Cox Proportional Hazards model [37] formalizes this by expressing each invoice's hazard rate, the instantaneous probability of payment at time t given non-payment until t, as a baseline hazard scaled by an exponential function of the invoice's covariates. Each invoice therefore receives a continuous risk profile (partial hazard, expected settlement time, survival probability at reference horizons) rather than a single binary flag, a conceptually richer representation of payment timing.</w:t>
       </w:r>
     </w:p>
     <w:p>
@@ -7824,7 +7819,7 @@
         <w:pStyle w:val="ThesisParagraphText"/>
       </w:pPr>
       <w:r>
-        <w:t>Moore and van Vuuren [4] integrated survival analysis with machine learning in the MIPP framework, using time-to-payment modeling to inform invoice predictions. This study extends that work in a specific way: instead of using the survival model as the predictor, it uses Cox PH outputs (hazard rates, survival probabilities, expected settlement times) as engineered input features for downstream classifiers, and then measures their marginal value experimentally. Prior work in credit risk suggests such features help probabilistic models more than tree ensembles [25, 35], a hypothesis this study tests directly across feature regimes.</w:t>
+        <w:t>Moore and van Vuuren [4] integrated survival analysis with machine learning in the MIPP framework, using time-to-payment modeling to inform invoice predictions. This study extends that work in a specific way: instead of using the survival model as the predictor, it uses Cox PH outputs (hazard rates, survival probabilities, expected settlement times) as engineered input features for downstream classifiers, and then measures their marginal value experimentally. Prior work in credit risk suggests such features help probabilistic models more than tree ensembles [28, 36], a hypothesis this study tests directly across feature regimes.</w:t>
       </w:r>
     </w:p>
     <w:p>
@@ -7843,7 +7838,7 @@
         <w:pStyle w:val="ThesisParagraphText"/>
       </w:pPr>
       <w:r>
-        <w:t>ML models outperform baseline statistical approaches in forecasting late payments and credit risk [29, 35]. Several gaps remain: (1) lack of granular student-product variables [3, 4, 8]; (2) limited application in private educational institutions [6, 30]; (3) few ordinal IPPP benchmarks; and (4) lack of two-stage architectures and systematic survival feature testing.</w:t>
+        <w:t>ML models outperform baseline statistical approaches in forecasting late payments and credit risk [7, 36]. Several gaps remain: (1) lack of granular student-product variables [3, 4, 5]; (2) limited application in private educational institutions [10, 31]; (3) few ordinal IPPP benchmarks; and (4) lack of two-stage architectures and systematic survival feature testing.</w:t>
       </w:r>
       <w:r>
         <w:br w:type="page"/>
@@ -7997,7 +7992,7 @@
           </w:tcPr>
           <w:p>
             <w:r>
-              <w:t>Schoonbee et al. [8]</w:t>
+              <w:t>Schoonbee et al. [5]</w:t>
             </w:r>
           </w:p>
         </w:tc>
@@ -8213,7 +8208,7 @@
           </w:tcPr>
           <w:p>
             <w:r>
-              <w:t>Martikainen [5]</w:t>
+              <w:t>Martikainen [6]</w:t>
             </w:r>
           </w:p>
         </w:tc>
@@ -8285,7 +8280,7 @@
           </w:tcPr>
           <w:p>
             <w:r>
-              <w:t>Cheong [29]</w:t>
+              <w:t>Cheong [7]</w:t>
             </w:r>
           </w:p>
         </w:tc>
@@ -8357,7 +8352,7 @@
           </w:tcPr>
           <w:p>
             <w:r>
-              <w:t>Appel et al. [28]</w:t>
+              <w:t>Appel et al. [8]</w:t>
             </w:r>
           </w:p>
         </w:tc>
@@ -8429,7 +8424,7 @@
           </w:tcPr>
           <w:p>
             <w:r>
-              <w:t>Thuy et al. [20]</w:t>
+              <w:t>Thuy et al. [23]</w:t>
             </w:r>
           </w:p>
         </w:tc>
@@ -8501,7 +8496,7 @@
           </w:tcPr>
           <w:p>
             <w:r>
-              <w:t>Abbas &amp; Hussein [12]</w:t>
+              <w:t>Abbas &amp; Hussein [9]</w:t>
             </w:r>
           </w:p>
         </w:tc>
@@ -8572,7 +8567,7 @@
         <w:pStyle w:val="ThesisParagraphText"/>
       </w:pPr>
       <w:r>
-        <w:t>Four patterns emerge from Table 2.2. First, tree-based ensembles and boosting algorithms are the consistent performance leaders across every domain in which they were tested, displacing both classical statistical models and, in the most recent comparison [20], deep learning alternatives on tabular financial data. Second, reported performance clusters in the 80–85% accuracy range for binary or coarse multi-class formulations, suggesting a practical ceiling for aggregate-feature approaches. Third, every study operates on aggregate customer- or student-level features; none models receivables at the granularity of individual fee categories, despite evidence from retail analytics [30] that fine-grained features improve prediction. Fourth, and most consequentially for this study, none of the eight works evaluates ordinal decompositions or hierarchical two-stage architectures, and none systematically tests survival-derived features against resampling strategies. The present study is positioned precisely in this gap: it benchmarks fifteen architectures, including three ordinal and six two-stage designs, across seven balancing strategies and two feature regimes on category-level educational invoices.</w:t>
+        <w:t>Four patterns emerge from Table 2.2. First, tree-based ensembles and boosting algorithms are the consistent performance leaders across every domain in which they were tested, displacing both classical statistical models and, in the most recent comparison [23], deep learning alternatives on tabular financial data. Second, reported performance clusters in the 80–85% accuracy range for binary or coarse multi-class formulations, suggesting a practical ceiling for aggregate-feature approaches. Third, every study operates on aggregate customer- or student-level features; none models receivables at the granularity of individual fee categories, despite evidence from retail analytics [31] that fine-grained features improve prediction. Fourth, and most consequentially for this study, none of the eight works evaluates ordinal decompositions or hierarchical two-stage architectures, and none systematically tests survival-derived features against resampling strategies. The present study is positioned precisely in this gap: it benchmarks fifteen architectures, including three ordinal and six two-stage designs, across seven balancing strategies and two feature regimes on category-level educational invoices.</w:t>
       </w:r>
     </w:p>
     <w:p>
@@ -8685,7 +8680,7 @@
         </w:sectPr>
       </w:pPr>
       <w:r>
-        <w:t>First, Information Processing Theory (IPT) [36] provides the foundation for data flow and preprocessing [1, 2]. Second, the Predictive Analytics and Machine Learning Paradigm (PA-MLP) supports the modeling stage [1, 2]. Third, Decision Support Systems (DSS) Theory [37, 38] justifies the analysis and interface components. Finally, Receivables Management Theory (RMT) [10, 39, 40] grounds the study in its financial context.</w:t>
+        <w:t>First, Information Processing Theory (IPT) [38] provides the foundation for data flow and preprocessing [1, 2]. Second, the Predictive Analytics and Machine Learning Paradigm (PA-MLP) supports the modeling stage [1, 2]. Third, Decision Support Systems (DSS) Theory [39, 40] justifies the analysis and interface components. Finally, Receivables Management Theory (RMT) [14, 41, 42] grounds the study in its financial context.</w:t>
       </w:r>
     </w:p>
     <w:p>
@@ -8732,7 +8727,7 @@
         <w:ind w:firstLine="0"/>
       </w:pPr>
       <w:r>
-        <w:t>This study employs a quantitative, experimental research design. The research paradigm is a controlled benchmarking study: fifteen machine learning architectures are compared under identical data, split, and evaluation conditions, with the manipulated factors being model family, hyperparameter configuration, class-balancing strategy, and feature regime — a factorial space of 1,092 configurations. Experimental comparison of this kind is the standard methodology for evaluating machine learning systems, as established in large-scale credit-scoring benchmarks such as Lessmann et al. [24].</w:t>
+        <w:t>This study employs a quantitative, experimental research design. The research paradigm is a controlled benchmarking study: fifteen machine learning architectures are compared under identical data, split, and evaluation conditions, with the manipulated factors being model family, hyperparameter configuration, class-balancing strategy, and feature regime — a factorial space of 1,092 configurations. Experimental comparison of this kind is the standard methodology for evaluating machine learning systems, as established in large-scale credit-scoring benchmarks such as Lessmann et al. [27].</w:t>
       </w:r>
     </w:p>
     <w:p>
@@ -11307,7 +11302,7 @@
         <w:t>(b) Ordinal Classifiers:</w:t>
       </w:r>
       <w:r>
-        <w:t xml:space="preserve"> Three architectures (Ordinal AdaBoost, Ordinal RF, Ordinal XGBoost) utilizing a Frank and Hall decomposition [9] to exploit the ordered nature of the payment brackets.</w:t>
+        <w:t xml:space="preserve"> Three architectures (Ordinal AdaBoost, Ordinal RF, Ordinal XGBoost) utilizing a Frank and Hall decomposition [12] to exploit the ordered nature of the payment brackets.</w:t>
       </w:r>
     </w:p>
     <w:p>
@@ -13232,7 +13227,7 @@
         <w:pStyle w:val="ThesisParagraphText"/>
       </w:pPr>
       <w:r>
-        <w:t>The ranges reflect three constraints. The computational budget capped each grid at roughly ten configurations per model so that the full 1,092-experiment benchmark remained tractable; the specific values follow prior benchmarking literature, which finds diminishing returns beyond moderate tree depths and ensemble sizes [24]; and the XGBoost grid was additionally shaped by GPU memory constraints, favoring moderate depth with subsampling over exhaustive expansion.</w:t>
+        <w:t>The ranges reflect three constraints. The computational budget capped each grid at roughly ten configurations per model so that the full 1,092-experiment benchmark remained tractable; the specific values follow prior benchmarking literature, which finds diminishing returns beyond moderate tree depths and ensemble sizes [27]; and the XGBoost grid was additionally shaped by GPU memory constraints, favoring moderate depth with subsampling over exhaustive expansion.</w:t>
       </w:r>
     </w:p>
     <w:p>
@@ -17669,7 +17664,7 @@
         <w:pStyle w:val="ThesisParagraphText"/>
       </w:pPr>
       <w:r>
-        <w:t>The distribution is extremely imbalanced: roughly 76% of invoices fall into Class 0 (on-time), while the three late brackets share the remainder, with the severest brackets the rarest. Left untreated, this imbalance lets a classifier achieve high accuracy by always predicting the majority class while failing entirely on the late invoices that matter operationally. It is this property that necessitates the resampling strategies evaluated in the benchmark — SMOTE [41], Borderline-SMOTE [42], SMOTE-Tomek [43], and threshold-based hybrid undersampling — and that motivates macro-averaged F1, which weights all four classes equally, as the primary evaluation metric, consistent with standard practice in imbalanced classification [44].</w:t>
+        <w:t>The distribution is extremely imbalanced: roughly 76% of invoices fall into Class 0 (on-time), while the three late brackets share the remainder, with the severest brackets the rarest. Left untreated, this imbalance lets a classifier achieve high accuracy by always predicting the majority class while failing entirely on the late invoices that matter operationally. It is this property that necessitates the resampling strategies evaluated in the benchmark — SMOTE [43], Borderline-SMOTE [44], SMOTE-Tomek [45], and threshold-based hybrid undersampling — and that motivates macro-averaged F1, which weights all four classes equally, as the primary evaluation metric, consistent with standard practice in imbalanced classification [46].</w:t>
       </w:r>
     </w:p>
     <w:p>
@@ -17835,7 +17830,7 @@
         <w:pStyle w:val="ThesisParagraphText"/>
       </w:pPr>
       <w:r>
-        <w:t>The dataset contains sensitive student financial records, and privacy was addressed before any analysis took place. All student identifiers were pseudonymized using a deterministic, irreversible hash implemented in a dedicated pseudonymization utility in the project codebase; no real names or student numbers appear in any processed file, and the mapping cannot be reversed from the published artifacts. Raw data files are never committed to version control — their exclusion is enforced through the repository's ignore rules — so the source records exist only within the institution's systems and the researchers' controlled working environment. These measures place the study in compliance with the Data Privacy Act of 2012 (Republic Act 10173) [46], which governs the processing of personal information in the Philippines and requires that processing be limited to declared, legitimate purposes with proportionate safeguards. Data access was granted under written institutional authorization, reproduced as Appendix G, which defines the scope of data access and the restrictions on its use. Finally, the predictive model outputs are intended for institutional receivables management only; they are not designed or released for individual student profiling for any public purpose.</w:t>
+        <w:t>The dataset contains sensitive student financial records, and privacy was addressed before any analysis took place. All student identifiers were pseudonymized using a deterministic, irreversible hash implemented in a dedicated pseudonymization utility in the project codebase; no real names or student numbers appear in any processed file, and the mapping cannot be reversed from the published artifacts. Raw data files are never committed to version control — their exclusion is enforced through the repository's ignore rules — so the source records exist only within the institution's systems and the researchers' controlled working environment. These measures place the study in compliance with the Data Privacy Act of 2012 (Republic Act 10173) [47], which governs the processing of personal information in the Philippines and requires that processing be limited to declared, legitimate purposes with proportionate safeguards. Data access was granted under written institutional authorization, reproduced as Appendix G, which defines the scope of data access and the restrictions on its use. Finally, the predictive model outputs are intended for institutional receivables management only; they are not designed or released for individual student profiling for any public purpose.</w:t>
       </w:r>
     </w:p>
     <w:p>
@@ -17851,7 +17846,7 @@
         <w:pStyle w:val="ThesisParagraphText"/>
       </w:pPr>
       <w:r>
-        <w:t>There is an inherent risk that machine learning predictions of payment delinquency could be used to discriminate against students from families with poor payment histories, and the researchers acknowledge this risk explicitly. Three mitigations are recommended wherever the system is deployed. First, predictions should inform early outreach and support — earlier reminders, proactive installment restructuring, or referral to social welfare assistance — and never punitive action against the student. Second, any intervention workflow built on the model must comply with Republic Act 11984 [7], which prohibits academic penalties, including examination denial, for outstanding balances; the system's outputs therefore cannot lawfully gate any academic activity. Third, the model should be audited periodically for demographic bias, comparing error rates across student segments, and retrained where disparities emerge. The study's framing is deliberately supportive rather than punitive: the goal is to enable schools to offer targeted payment assistance earlier, not to flag students for enforcement, and this orientation is embedded in the recommendations of Chapter 5.</w:t>
+        <w:t>There is an inherent risk that machine learning predictions of payment delinquency could be used to discriminate against students from families with poor payment histories, and the researchers acknowledge this risk explicitly. Three mitigations are recommended wherever the system is deployed. First, predictions should inform early outreach and support — earlier reminders, proactive installment restructuring, or referral to social welfare assistance — and never punitive action against the student. Second, any intervention workflow built on the model must comply with Republic Act 11984 [11], which prohibits academic penalties, including examination denial, for outstanding balances; the system's outputs therefore cannot lawfully gate any academic activity. Third, the model should be audited periodically for demographic bias, comparing error rates across student segments, and retrained where disparities emerge. The study's framing is deliberately supportive rather than punitive: the goal is to enable schools to offer targeted payment assistance earlier, not to flag students for enforcement, and this orientation is embedded in the recommendations of Chapter 5.</w:t>
       </w:r>
     </w:p>
     <w:p>
@@ -22969,23 +22964,7 @@
         <w:ind w:hanging="720"/>
       </w:pPr>
       <w:r>
-        <w:t xml:space="preserve">[3] K. Mugorobin, S. Kusrini, S. </w:t>
-      </w:r>
-      <w:proofErr w:type="spellStart"/>
-      <w:r>
-        <w:t>Rokhmah</w:t>
-      </w:r>
-      <w:proofErr w:type="spellEnd"/>
-      <w:r>
-        <w:t xml:space="preserve">, and I. </w:t>
-      </w:r>
-      <w:proofErr w:type="spellStart"/>
-      <w:r>
-        <w:t>Muslibah</w:t>
-      </w:r>
-      <w:proofErr w:type="spellEnd"/>
-      <w:r>
-        <w:t>. 2020. Estimation system for late payment of school tuition fees. International Journal of Computer and Information System 1, 1 (2020).</w:t>
+        <w:t>[3] K. Mugorobin, S. Kusrini, S. Rokhmah, and I. Muslibah. 2020. Estimation system for late payment of school tuition fees. International Journal of Computer and Information System 1, 1 (2020).</w:t>
       </w:r>
     </w:p>
     <w:p>
@@ -23003,7 +22982,7 @@
         <w:ind w:hanging="720"/>
       </w:pPr>
       <w:r>
-        <w:t>[5] M. Martikainen. 2023. Predicting late payment of sales invoices with statistical learning methods. Lappeenranta-Lahti University of Technology LUT, School of Engineering Science: Computational Engineering.</w:t>
+        <w:t>[5] L. Schoonbee, W. R. Moore, and J. H. van Vuuren. 2021. A machine-learning approach towards solving the invoice payment prediction problem. Journal of Computational Finance 14, 3 (2021), 101-118.</w:t>
       </w:r>
     </w:p>
     <w:p>
@@ -23012,7 +22991,7 @@
         <w:ind w:hanging="720"/>
       </w:pPr>
       <w:r>
-        <w:t>[6] A. M. Khedr and R. S. Sheeja. 2024. Enhancing supply chain management with deep learning and machine learning techniques: A review. Journal of Open Innovation: Technology, Market and Complexity (2024). https://doi.org/10.1016/j.joitmc.2024.100379</w:t>
+        <w:t>[6] M. Martikainen. 2023. Predicting late payment of sales invoices with statistical learning methods. Lappeenranta-Lahti University of Technology LUT, School of Engineering Science: Computational Engineering.</w:t>
       </w:r>
     </w:p>
     <w:p>
@@ -23021,7 +23000,7 @@
         <w:ind w:hanging="720"/>
       </w:pPr>
       <w:r>
-        <w:t>[7] Republic of the Philippines. 2024. Republic Act No. 11984: An Act Providing for the Free College Entrance Examinations Act. (Also known as No Permit, No Exam Prohibition Act). Official Gazette of the Republic of the Philippines.</w:t>
+        <w:t>[7] M. Cheong. 2022. Customer level predictive modeling for accounts receivable to reduce intervention actions. Journal of Business Analytics 15, 3 (2022), 45-60.</w:t>
       </w:r>
     </w:p>
     <w:p>
@@ -23030,8 +23009,7 @@
         <w:ind w:hanging="720"/>
       </w:pPr>
       <w:r>
-        <w:lastRenderedPageBreak/>
-        <w:t>[8] L. Schoonbee, W. R. Moore, and J. H. van Vuuren. 2021. A machine-learning approach towards solving the invoice payment prediction problem. Journal of Computational Finance 14, 3 (2021), 101-118.</w:t>
+        <w:t>[8] A. P. Appel, G. L. Malfatti, R. Cunha, B. Lima, and R. de Paula. 2021. Predicting account receivables with machine learning. Journal of Financial Technology 10, 2 (2021), 88-102.</w:t>
       </w:r>
     </w:p>
     <w:p>
@@ -23040,7 +23018,7 @@
         <w:ind w:hanging="720"/>
       </w:pPr>
       <w:r>
-        <w:t>[9] E. Frank and M. Hall. 2001. A simple approach to ordinal classification. In Proceedings of the 12th European Conference on Machine Learning (ECML 2001), Lecture Notes in Computer Science 2167, 145-156. Springer. https://doi.org/10.1007/3-540-44795-4_13</w:t>
+        <w:t>[9] A. Abbas and A. Hussein. 2024. Data-driven loan default prediction: A machine learning approach. Systems 13, 7 (2024), 581. MDPI. https://doi.org/10.3390/systems13070581</w:t>
       </w:r>
     </w:p>
     <w:p>
@@ -23049,7 +23027,7 @@
         <w:ind w:hanging="720"/>
       </w:pPr>
       <w:r>
-        <w:t>[10] Y. Peng and G. Tian. 2021. Intelligent optimization model of enterprise financial account receivable management. International Journal of Management Science 18, 1 (2021), 112-128. https://doi.org/10.1155/2024/4961081</w:t>
+        <w:t>[10] A. M. Khedr and R. S. Sheeja. 2024. Enhancing supply chain management with deep learning and machine learning techniques: A review. Journal of Open Innovation: Technology, Market and Complexity (2024). https://doi.org/10.1016/j.joitmc.2024.100379</w:t>
       </w:r>
     </w:p>
     <w:p>
@@ -23058,7 +23036,7 @@
         <w:ind w:hanging="720"/>
       </w:pPr>
       <w:r>
-        <w:t>[11] M. Ramkumar and R. Karthick. 2023. Finance forecasting using machine learning: A data-driven approach. International Journal of Data Science and Machine Learning 4, 2 (2023), 540-558.</w:t>
+        <w:t>[11] Republic of the Philippines. 2024. Republic Act No. 11984: An Act Providing for the Free College Entrance Examinations Act. (Also known as No Permit, No Exam Prohibition Act). Official Gazette of the Republic of the Philippines.</w:t>
       </w:r>
     </w:p>
     <w:p>
@@ -23067,7 +23045,7 @@
         <w:ind w:hanging="720"/>
       </w:pPr>
       <w:r>
-        <w:t>[12] A. Abbas and A. Hussein. 2024. Data-driven loan default prediction: A machine learning approach. Systems 13, 7 (2024), 581. MDPI. https://doi.org/10.3390/systems13070581</w:t>
+        <w:t>[12] E. Frank and M. Hall. 2001. A simple approach to ordinal classification. In Proceedings of the 12th European Conference on Machine Learning (ECML 2001), Lecture Notes in Computer Science 2167, 145-156. Springer. https://doi.org/10.1007/3-540-44795-4_13</w:t>
       </w:r>
     </w:p>
     <w:p>
@@ -23076,7 +23054,7 @@
         <w:ind w:hanging="720"/>
       </w:pPr>
       <w:r>
-        <w:t>[13] Respicio &amp; Co. Law. 2025. No permit, no exam policy for unpaid tuition in Philippine schools. Respicio.ph.</w:t>
+        <w:t>[13] United Nations. 2015. Transforming our world: The 2030 agenda for sustainable development. United Nations General Assembly.</w:t>
       </w:r>
     </w:p>
     <w:p>
@@ -23085,7 +23063,7 @@
         <w:ind w:hanging="720"/>
       </w:pPr>
       <w:r>
-        <w:t>[14] R. Mestry. 2020. The effective and efficient management of school fees. South African Journal of Education 40, 4 (2020).</w:t>
+        <w:t>[14] Y. Peng and G. Tian. 2021. Intelligent optimization model of enterprise financial account receivable management. International Journal of Management Science 18, 1 (2021), 112-128. https://doi.org/10.1155/2024/4961081</w:t>
       </w:r>
     </w:p>
     <w:p>
@@ -23094,7 +23072,7 @@
         <w:ind w:hanging="720"/>
       </w:pPr>
       <w:r>
-        <w:t>[15] I. Naicker. 2020. Responding to school funding challenges in no-fee and fee-paying schools: Lessons from South African principals. South African Journal of Education 40, 1 (2020).</w:t>
+        <w:t>[15] M. Ramkumar and R. Karthick. 2023. Finance forecasting using machine learning: A data-driven approach. International Journal of Data Science and Machine Learning 4, 2 (2023), 540-558.</w:t>
       </w:r>
     </w:p>
     <w:p>
@@ -23103,7 +23081,7 @@
         <w:ind w:hanging="720"/>
       </w:pPr>
       <w:r>
-        <w:t>[16] Education Policy and Data Center. 2012. School fees in South Africa (Case study). EPDC.</w:t>
+        <w:t>[16] Respicio &amp; Co. Law. 2025. No permit, no exam policy for unpaid tuition in Philippine schools. Respicio.ph.</w:t>
       </w:r>
     </w:p>
     <w:p>
@@ -23112,8 +23090,7 @@
         <w:ind w:hanging="720"/>
       </w:pPr>
       <w:r>
-        <w:lastRenderedPageBreak/>
-        <w:t>[17] MRI Software TPN Credit Bureau. 2024. The legal consequences of unpaid school fees in South Africa. MRI Software TPN.</w:t>
+        <w:t>[17] R. Mestry. 2020. The effective and efficient management of school fees. South African Journal of Education 40, 4 (2020).</w:t>
       </w:r>
     </w:p>
     <w:p>
@@ -23122,7 +23099,7 @@
         <w:ind w:hanging="720"/>
       </w:pPr>
       <w:r>
-        <w:t>[18] The Associated Press. 2024. Parents in Africa struggle with unpredictable school fees that force children to drop out. Associated Press.</w:t>
+        <w:t>[18] I. Naicker. 2020. Responding to school funding challenges in no-fee and fee-paying schools: Lessons from South African principals. South African Journal of Education 40, 1 (2020).</w:t>
       </w:r>
     </w:p>
     <w:p>
@@ -23131,7 +23108,7 @@
         <w:ind w:hanging="720"/>
       </w:pPr>
       <w:r>
-        <w:t>[19] World Bank. 2024. Urgent education reform key to unlocking faster, more inclusive growth in Africa. World Bank.</w:t>
+        <w:t>[19] Education Policy and Data Center. 2012. School fees in South Africa (Case study). EPDC.</w:t>
       </w:r>
     </w:p>
     <w:p>
@@ -23140,7 +23117,7 @@
         <w:ind w:hanging="720"/>
       </w:pPr>
       <w:r>
-        <w:t>[20] N.T.H. Thuy, N.T.V. Ha, N.N. Trung, V.T.T. Binh, N.T. Hang, and V.T. Binh. 2025. Comparing the effectiveness of machine learning and deep learning models in student credit scoring: A case study in Vietnam. Risks 13, 5 (2025), 99. https://doi.org/10.3390/risks13050099</w:t>
+        <w:t>[20] MRI Software TPN Credit Bureau. 2024. The legal consequences of unpaid school fees in South Africa. MRI Software TPN.</w:t>
       </w:r>
     </w:p>
     <w:p>
@@ -23149,31 +23126,7 @@
         <w:ind w:hanging="720"/>
       </w:pPr>
       <w:r>
-        <w:t xml:space="preserve">[21] W.C. Carvajal, C.M. Baltonado, M.G. </w:t>
-      </w:r>
-      <w:proofErr w:type="spellStart"/>
-      <w:r>
-        <w:t>Gocela</w:t>
-      </w:r>
-      <w:proofErr w:type="spellEnd"/>
-      <w:r>
-        <w:t xml:space="preserve">, L.J. </w:t>
-      </w:r>
-      <w:proofErr w:type="spellStart"/>
-      <w:r>
-        <w:t>Pajes</w:t>
-      </w:r>
-      <w:proofErr w:type="spellEnd"/>
-      <w:r>
-        <w:t xml:space="preserve">, A.J. Soliman, H. Bankas, C.K.F. </w:t>
-      </w:r>
-      <w:proofErr w:type="spellStart"/>
-      <w:r>
-        <w:t>Lubon</w:t>
-      </w:r>
-      <w:proofErr w:type="spellEnd"/>
-      <w:r>
-        <w:t>, and M.E. Albano. 2025. Level of financial literacy and debt management: Basis for personal financial management program. Psychology and Education: A Multidisciplinary Journal 41, 2 (2025), 206-215.</w:t>
+        <w:t>[21] The Associated Press. 2024. Parents in Africa struggle with unpredictable school fees that force children to drop out. Associated Press.</w:t>
       </w:r>
     </w:p>
     <w:p>
@@ -23182,15 +23135,7 @@
         <w:ind w:hanging="720"/>
       </w:pPr>
       <w:r>
-        <w:t xml:space="preserve">[22] M.C.L. Mencias-Tabernilla. 2023. Exploring teachers' expenditure patterns and debt profile. </w:t>
-      </w:r>
-      <w:proofErr w:type="spellStart"/>
-      <w:r>
-        <w:t>PhilArchive</w:t>
-      </w:r>
-      <w:proofErr w:type="spellEnd"/>
-      <w:r>
-        <w:t>.</w:t>
+        <w:t>[22] World Bank. 2024. Urgent education reform key to unlocking faster, more inclusive growth in Africa. World Bank.</w:t>
       </w:r>
     </w:p>
     <w:p>
@@ -23199,15 +23144,7 @@
         <w:ind w:hanging="720"/>
       </w:pPr>
       <w:r>
-        <w:t xml:space="preserve">[23] Presidential Communications Office. 2024. PBBM signs "No Permit, No Exam Prohibition Act" allowing students with unpaid tuition fees to take </w:t>
-      </w:r>
-      <w:proofErr w:type="gramStart"/>
-      <w:r>
-        <w:t>exam</w:t>
-      </w:r>
-      <w:proofErr w:type="gramEnd"/>
-      <w:r>
-        <w:t>. PCO.</w:t>
+        <w:t>[23] N.T.H. Thuy, N.T.V. Ha, N.N. Trung, V.T.T. Binh, N.T. Hang, and V.T. Binh. 2025. Comparing the effectiveness of machine learning and deep learning models in student credit scoring: A case study in Vietnam. Risks 13, 5 (2025), 99. https://doi.org/10.3390/risks13050099</w:t>
       </w:r>
     </w:p>
     <w:p>
@@ -23216,7 +23153,7 @@
         <w:ind w:hanging="720"/>
       </w:pPr>
       <w:r>
-        <w:t>[24] S. Lessmann, B. Baesens, H. V. Seow, and L. C. Thomas. 2015. Benchmarking state-of-the-art classification algorithms for credit scoring: An update of research. European Journal of Operational Research 247, 1 (2015), 124-136. https://doi.org/10.1016/j.ejor.2015.05.030</w:t>
+        <w:t>[24] W.C. Carvajal, C.M. Baltonado, M.G. Gocela, L.J. Pajes, A.J. Soliman, H. Bankas, C.K.F. Lubon, and M.E. Albano. 2025. Level of financial literacy and debt management: Basis for personal financial management program. Psychology and Education: A Multidisciplinary Journal 41, 2 (2025), 206-215.</w:t>
       </w:r>
     </w:p>
     <w:p>
@@ -23225,24 +23162,7 @@
         <w:ind w:hanging="720"/>
       </w:pPr>
       <w:r>
-        <w:lastRenderedPageBreak/>
-        <w:t xml:space="preserve">[25] B. Baesens, R. </w:t>
-      </w:r>
-      <w:proofErr w:type="spellStart"/>
-      <w:r>
-        <w:t>Setiono</w:t>
-      </w:r>
-      <w:proofErr w:type="spellEnd"/>
-      <w:r>
-        <w:t xml:space="preserve">, C. Mues, and J. </w:t>
-      </w:r>
-      <w:proofErr w:type="spellStart"/>
-      <w:r>
-        <w:t>Vanthienen</w:t>
-      </w:r>
-      <w:proofErr w:type="spellEnd"/>
-      <w:r>
-        <w:t>. 2003. Using neural network rule extraction and decision tables for credit-risk evaluation. Management Science 49, 3 (2003), 312-329.</w:t>
+        <w:t>[25] M.C.L. Mencias-Tabernilla. 2023. Exploring teachers' expenditure patterns and debt profile. PhilArchive.</w:t>
       </w:r>
     </w:p>
     <w:p>
@@ -23251,7 +23171,7 @@
         <w:ind w:hanging="720"/>
       </w:pPr>
       <w:r>
-        <w:t>[26] K. Xu, Y. Wu, Z. Li, R. Zhang, and Z. Feng. 2024. Investigating financial risk behavior prediction using deep learning and big data. International Journal of Innovative Research in Engineering and Management 11, 3 (2024).</w:t>
+        <w:t>[26] Presidential Communications Office. 2024. PBBM signs "No Permit, No Exam Prohibition Act" allowing students with unpaid tuition fees to take exam. PCO.</w:t>
       </w:r>
     </w:p>
     <w:p>
@@ -23260,7 +23180,7 @@
         <w:ind w:hanging="720"/>
       </w:pPr>
       <w:r>
-        <w:t>[27] C. F. Tsai, C. W. Huang, and C. W. Chen. 2017. Credit rating by hybrid machine learning techniques. Applied Soft Computing 26 (2017), 170-182.</w:t>
+        <w:t>[27] S. Lessmann, B. Baesens, H. V. Seow, and L. C. Thomas. 2015. Benchmarking state-of-the-art classification algorithms for credit scoring: An update of research. European Journal of Operational Research 247, 1 (2015), 124-136. https://doi.org/10.1016/j.ejor.2015.05.030</w:t>
       </w:r>
     </w:p>
     <w:p>
@@ -23269,7 +23189,7 @@
         <w:ind w:hanging="720"/>
       </w:pPr>
       <w:r>
-        <w:t>[28] A. P. Appel, G. L. Malfatti, R. Cunha, B. Lima, and R. de Paula. 2021. Predicting account receivables with machine learning. Journal of Financial Technology 10, 2 (2021), 88-102.</w:t>
+        <w:t>[28] B. Baesens, R. Setiono, C. Mues, and J. Vanthienen. 2003. Using neural network rule extraction and decision tables for credit-risk evaluation. Management Science 49, 3 (2003), 312-329.</w:t>
       </w:r>
     </w:p>
     <w:p>
@@ -23278,7 +23198,7 @@
         <w:ind w:hanging="720"/>
       </w:pPr>
       <w:r>
-        <w:t>[29] M. Cheong. 2022. Customer level predictive modeling for accounts receivable to reduce intervention actions. Journal of Business Analytics 15, 3 (2022), 45-60.</w:t>
+        <w:t>[29] K. Xu, Y. Wu, Z. Li, R. Zhang, and Z. Feng. 2024. Investigating financial risk behavior prediction using deep learning and big data. International Journal of Innovative Research in Engineering and Management 11, 3 (2024).</w:t>
       </w:r>
     </w:p>
     <w:p>
@@ -23287,7 +23207,7 @@
         <w:ind w:hanging="720"/>
       </w:pPr>
       <w:r>
-        <w:t>[30] X.-S. Wei, Q. Cui, L. Yang, P. Wang, L. Liu, and J. Yang. 2022. RPC: A large-scale and fine-grained retail product checkout dataset. Science China Information Sciences 65, 197101 (2022).</w:t>
+        <w:t>[30] C. F. Tsai, C. W. Huang, and C. W. Chen. 2017. Credit rating by hybrid machine learning techniques. Applied Soft Computing 26 (2017), 170-182.</w:t>
       </w:r>
     </w:p>
     <w:p>
@@ -23296,15 +23216,7 @@
         <w:ind w:hanging="720"/>
       </w:pPr>
       <w:r>
-        <w:t xml:space="preserve">[31] H. Voghouei, M. A. Jamali, and S. B. </w:t>
-      </w:r>
-      <w:proofErr w:type="spellStart"/>
-      <w:r>
-        <w:t>Pormehr</w:t>
-      </w:r>
-      <w:proofErr w:type="spellEnd"/>
-      <w:r>
-        <w:t>. 2020. The effect of political factors on financial development. IOSR Journal of Economics and Finance 11, 3 (2020), 41-55.</w:t>
+        <w:t>[31] X.-S. Wei, Q. Cui, L. Yang, P. Wang, L. Liu, and J. Yang. 2022. RPC: A large-scale and fine-grained retail product checkout dataset. Science China Information Sciences 65, 197101 (2022).</w:t>
       </w:r>
     </w:p>
     <w:p>
@@ -23313,7 +23225,7 @@
         <w:ind w:hanging="720"/>
       </w:pPr>
       <w:r>
-        <w:t>[32] Varthana. 2023. 5 Ways to Improve School Fee Collections. Varthana School Finance.</w:t>
+        <w:t>[32] H. Voghouei, M. A. Jamali, and S. B. Pormehr. 2020. The effect of political factors on financial development. IOSR Journal of Economics and Finance 11, 3 (2020), 41-55.</w:t>
       </w:r>
     </w:p>
     <w:p>
@@ -23322,23 +23234,7 @@
         <w:ind w:hanging="720"/>
       </w:pPr>
       <w:r>
-        <w:t xml:space="preserve">[33] </w:t>
-      </w:r>
-      <w:proofErr w:type="spellStart"/>
-      <w:r>
-        <w:t>Finalsite</w:t>
-      </w:r>
-      <w:proofErr w:type="spellEnd"/>
-      <w:r>
-        <w:t xml:space="preserve">. 2023. 5 Ways to Increase Your School's Tuition Collection Rates. </w:t>
-      </w:r>
-      <w:proofErr w:type="spellStart"/>
-      <w:r>
-        <w:t>Finalsite</w:t>
-      </w:r>
-      <w:proofErr w:type="spellEnd"/>
-      <w:r>
-        <w:t xml:space="preserve"> Blog.</w:t>
+        <w:t>[33] Varthana. 2023. 5 Ways to Improve School Fee Collections. Varthana School Finance.</w:t>
       </w:r>
     </w:p>
     <w:p>
@@ -23347,7 +23243,7 @@
         <w:ind w:hanging="720"/>
       </w:pPr>
       <w:r>
-        <w:t>[34] Frontline Collections. 2024. Debt Collection in the Education Sector: Tuition Fee Recovery Strategies. Frontline Collections.</w:t>
+        <w:t>[34] Finalsite. 2023. 5 Ways to Increase Your School's Tuition Collection Rates. Finalsite Blog.</w:t>
       </w:r>
     </w:p>
     <w:p>
@@ -23356,24 +23252,7 @@
         <w:ind w:hanging="720"/>
       </w:pPr>
       <w:r>
-        <w:lastRenderedPageBreak/>
-        <w:t xml:space="preserve">[35] J. </w:t>
-      </w:r>
-      <w:proofErr w:type="spellStart"/>
-      <w:r>
-        <w:t>Olamijuwon</w:t>
-      </w:r>
-      <w:proofErr w:type="spellEnd"/>
-      <w:r>
-        <w:t xml:space="preserve"> and S. J. C. </w:t>
-      </w:r>
-      <w:proofErr w:type="spellStart"/>
-      <w:r>
-        <w:t>Zouo</w:t>
-      </w:r>
-      <w:proofErr w:type="spellEnd"/>
-      <w:r>
-        <w:t>. 2024. Machine learning in budget forecasting for corporate finance: A conceptual model for improving financial planning. Open Access Research Journal of Multidisciplinary Studies 8, 2 (2024).</w:t>
+        <w:t>[35] Frontline Collections. 2024. Debt Collection in the Education Sector: Tuition Fee Recovery Strategies. Frontline Collections.</w:t>
       </w:r>
     </w:p>
     <w:p>
@@ -23382,15 +23261,7 @@
         <w:ind w:hanging="720"/>
       </w:pPr>
       <w:r>
-        <w:t xml:space="preserve">[36] I. Goldstein, A. </w:t>
-      </w:r>
-      <w:proofErr w:type="spellStart"/>
-      <w:r>
-        <w:t>Ozdenoren</w:t>
-      </w:r>
-      <w:proofErr w:type="spellEnd"/>
-      <w:r>
-        <w:t>, and K. Yuan. 2013. Trading frenzies and their impact on real investment. Journal of Financial Economics 109, 2 (2013), 566-582.</w:t>
+        <w:t>[36] J. Olamijuwon and S. J. C. Zouo. 2024. Machine learning in budget forecasting for corporate finance: A conceptual model for improving financial planning. Open Access Research Journal of Multidisciplinary Studies 8, 2 (2024).</w:t>
       </w:r>
     </w:p>
     <w:p>
@@ -23399,23 +23270,7 @@
         <w:ind w:hanging="720"/>
       </w:pPr>
       <w:r>
-        <w:t xml:space="preserve">[37] </w:t>
-      </w:r>
-      <w:proofErr w:type="spellStart"/>
-      <w:r>
-        <w:t>FasterCapital</w:t>
-      </w:r>
-      <w:proofErr w:type="spellEnd"/>
-      <w:r>
-        <w:t xml:space="preserve">. 2023. Decision Support Systems: Empowering Financial Decisions with AI-Driven Support Systems. </w:t>
-      </w:r>
-      <w:proofErr w:type="spellStart"/>
-      <w:r>
-        <w:t>FasterCapital</w:t>
-      </w:r>
-      <w:proofErr w:type="spellEnd"/>
-      <w:r>
-        <w:t>.</w:t>
+        <w:t>[37] D. R. Cox. 1972. Regression models and life-tables. Journal of the Royal Statistical Society. Series B (Methodological) 34, 2 (1972), 187-202.</w:t>
       </w:r>
     </w:p>
     <w:p>
@@ -23424,7 +23279,7 @@
         <w:ind w:hanging="720"/>
       </w:pPr>
       <w:r>
-        <w:t>[38] Caine &amp; Weiner. 2023. Accounts Receivable Management in Education: Key Aspects and Strategies. Caine &amp; Weiner.</w:t>
+        <w:t>[38] I. Goldstein, A. Ozdenoren, and K. Yuan. 2013. Trading frenzies and their impact on real investment. Journal of Financial Economics 109, 2 (2013), 566-582.</w:t>
       </w:r>
     </w:p>
     <w:p>
@@ -23433,7 +23288,7 @@
         <w:ind w:hanging="720"/>
       </w:pPr>
       <w:r>
-        <w:t>[39] Higher Ed Dive. 2023. 3 Reasons Accounts Receivable Management in Higher Education Suffers -- and How to Fix It. Higher Ed Dive.</w:t>
+        <w:t>[39] FasterCapital. 2023. Decision Support Systems: Empowering Financial Decisions with AI-Driven Support Systems. FasterCapital.</w:t>
       </w:r>
     </w:p>
     <w:p>
@@ -23442,15 +23297,7 @@
         <w:ind w:hanging="720"/>
       </w:pPr>
       <w:r>
-        <w:t xml:space="preserve">[40] A. Caparros. 2023. Effects of Students Extracurricular Activities </w:t>
-      </w:r>
-      <w:proofErr w:type="gramStart"/>
-      <w:r>
-        <w:t>to</w:t>
-      </w:r>
-      <w:proofErr w:type="gramEnd"/>
-      <w:r>
-        <w:t xml:space="preserve"> Schools Internal Efficiency: Basis for School Improvement Management Plan. Psychology and Education: A Multidisciplinary Journal 7, 10 (2023), 1-1.</w:t>
+        <w:t>[40] Caine &amp; Weiner. 2023. Accounts Receivable Management in Education: Key Aspects and Strategies. Caine &amp; Weiner.</w:t>
       </w:r>
     </w:p>
     <w:p>
@@ -23459,7 +23306,7 @@
         <w:ind w:hanging="720"/>
       </w:pPr>
       <w:r>
-        <w:t>[41] O. Olawale Awe. Computational Strategies for Handling Imbalanced Data in Machine Learning.</w:t>
+        <w:t>[41] Higher Ed Dive. 2023. 3 Reasons Accounts Receivable Management in Higher Education Suffers -- and How to Fix It. Higher Ed Dive.</w:t>
       </w:r>
     </w:p>
     <w:p>
@@ -23468,7 +23315,7 @@
         <w:ind w:hanging="720"/>
       </w:pPr>
       <w:r>
-        <w:t>[42] 5 Effective Ways to Handle Imbalanced Data in Machine Learning. MachineLearningMastery.com.</w:t>
+        <w:t>[42] A. Caparros. 2023. Effects of Students Extracurricular Activities to Schools Internal Efficiency: Basis for School Improvement Management Plan. Psychology and Education: A Multidisciplinary Journal 7, 10 (2023), 1-1.</w:t>
       </w:r>
     </w:p>
     <w:p>
@@ -23477,15 +23324,31 @@
         <w:ind w:hanging="720"/>
       </w:pPr>
       <w:r>
-        <w:t xml:space="preserve">[43] Handling Imbalanced Data for Classification. </w:t>
-      </w:r>
-      <w:proofErr w:type="spellStart"/>
-      <w:r>
-        <w:t>GeeksforGeeks</w:t>
-      </w:r>
-      <w:proofErr w:type="spellEnd"/>
-      <w:r>
-        <w:t>.</w:t>
+        <w:t>[43] N. V. Chawla, K. W. Bowyer, L. O. Hall, and W. P. Kegelmeyer. 2002. SMOTE: Synthetic minority over-sampling technique. Journal of Artificial Intelligence Research 16 (2002), 321-357. https://doi.org/10.1613/jair.953</w:t>
+      </w:r>
+    </w:p>
+    <w:p>
+      <w:pPr/>
+      <w:r>
+        <w:t>[44] H. Han, W.-Y. Wang, and B.-H. Mao. 2005. Borderline-SMOTE: A new over-sampling method in imbalanced data sets learning. In Advances in Intelligent Computing (ICIC 2005), Lecture Notes in Computer Science 3644, 878-887. Springer. https://doi.org/10.1007/11538059_91</w:t>
+      </w:r>
+    </w:p>
+    <w:p>
+      <w:pPr/>
+      <w:r>
+        <w:t>[45] G. E. A. P. A. Batista, R. C. Prati, and M. C. Monard. 2004. A study of the behavior of several methods for balancing machine learning training data. ACM SIGKDD Explorations Newsletter 6, 1 (2004), 20-29. https://doi.org/10.1145/1007730.1007735</w:t>
+      </w:r>
+    </w:p>
+    <w:p>
+      <w:pPr/>
+      <w:r>
+        <w:t>[46] H. He and E. A. Garcia. 2009. Learning from imbalanced data. IEEE Transactions on Knowledge and Data Engineering 21, 9 (2009), 1263-1284. https://doi.org/10.1109/TKDE.2008.239</w:t>
+      </w:r>
+    </w:p>
+    <w:p>
+      <w:pPr/>
+      <w:r>
+        <w:t>[47] Republic of the Philippines. 2012. Republic Act No. 10173: Data Privacy Act of 2012. Official Gazette of the Republic of the Philippines.</w:t>
       </w:r>
     </w:p>
     <w:sectPr>

</xml_diff>